<commit_message>
Corrected onrender API URL to https://mike-jov1.onrender.com
</commit_message>
<xml_diff>
--- a/Labs/EG 02- Unit testing C#.docx
+++ b/Labs/EG 02- Unit testing C#.docx
@@ -2503,7 +2503,7 @@
           <w:szCs w:val="20"/>
           <w:lang w:eastAsia="en-US"/>
         </w:rPr>
-        <w:t>"https://tx100.</w:t>
+        <w:t>"</w:t>
       </w:r>
       <w:r>
         <w:rPr>
@@ -2515,7 +2515,7 @@
           <w:szCs w:val="20"/>
           <w:lang w:eastAsia="en-US"/>
         </w:rPr>
-        <w:t>onrender.com</w:t>
+        <w:t>https://mike-jov1.onrender.com</w:t>
       </w:r>
       <w:r>
         <w:rPr>
@@ -2551,7 +2551,7 @@
           <w:szCs w:val="20"/>
           <w:lang w:eastAsia="en-US"/>
         </w:rPr>
-        <w:t>// Base API URL</w:t>
+        <w:t>// Base API</w:t>
       </w:r>
     </w:p>
     <w:p>
@@ -4772,7 +4772,7 @@
           <w:szCs w:val="20"/>
           <w:lang w:eastAsia="en-US"/>
         </w:rPr>
-        <w:t>"https://tx100.</w:t>
+        <w:t>"</w:t>
       </w:r>
       <w:r>
         <w:rPr>
@@ -4784,7 +4784,7 @@
           <w:szCs w:val="20"/>
           <w:lang w:eastAsia="en-US"/>
         </w:rPr>
-        <w:t>onrender.com</w:t>
+        <w:t>https://mike-jov1.onrender.com</w:t>
       </w:r>
       <w:r>
         <w:rPr>
@@ -4820,7 +4820,7 @@
           <w:szCs w:val="20"/>
           <w:lang w:eastAsia="en-US"/>
         </w:rPr>
-        <w:t>// Base API URL</w:t>
+        <w:t>// Base API</w:t>
       </w:r>
     </w:p>
     <w:p>
@@ -11113,6 +11113,29 @@
       <w:szCs w:val="24"/>
     </w:rPr>
   </w:style>
+  <w:style w:type="character" w:styleId="Hyperlink">
+    <w:name w:val="Hyperlink"/>
+    <w:basedOn w:val="DefaultParagraphFont"/>
+    <w:uiPriority w:val="99"/>
+    <w:unhideWhenUsed/>
+    <w:rsid w:val="00F31929"/>
+    <w:rPr>
+      <w:color w:val="467886" w:themeColor="hyperlink"/>
+      <w:u w:val="single"/>
+    </w:rPr>
+  </w:style>
+  <w:style w:type="character" w:styleId="UnresolvedMention">
+    <w:name w:val="Unresolved Mention"/>
+    <w:basedOn w:val="DefaultParagraphFont"/>
+    <w:uiPriority w:val="99"/>
+    <w:semiHidden/>
+    <w:unhideWhenUsed/>
+    <w:rsid w:val="00F31929"/>
+    <w:rPr>
+      <w:color w:val="605E5C"/>
+      <w:shd w:val="clear" w:color="auto" w:fill="E1DFDD"/>
+    </w:rPr>
+  </w:style>
 </w:styles>
 </file>
 

</xml_diff>

<commit_message>
reinstated tx100 customers URL
</commit_message>
<xml_diff>
--- a/Labs/EG 02- Unit testing C#.docx
+++ b/Labs/EG 02- Unit testing C#.docx
@@ -7,8 +7,21 @@
         <w:pStyle w:val="Heading1"/>
       </w:pPr>
       <w:r>
-        <w:t>Lab: Unit Testing with MSTest – UserService</w:t>
-      </w:r>
+        <w:t xml:space="preserve">Lab: Unit Testing with </w:t>
+      </w:r>
+      <w:proofErr w:type="spellStart"/>
+      <w:r>
+        <w:t>MSTest</w:t>
+      </w:r>
+      <w:proofErr w:type="spellEnd"/>
+      <w:r>
+        <w:t xml:space="preserve"> – </w:t>
+      </w:r>
+      <w:proofErr w:type="spellStart"/>
+      <w:r>
+        <w:t>UserService</w:t>
+      </w:r>
+      <w:proofErr w:type="spellEnd"/>
     </w:p>
     <w:p>
       <w:pPr>
@@ -40,7 +53,15 @@
         </w:numPr>
       </w:pPr>
       <w:r>
-        <w:t>Implement a simple UserService class with basic business rules.</w:t>
+        <w:t xml:space="preserve">Implement a simple </w:t>
+      </w:r>
+      <w:proofErr w:type="spellStart"/>
+      <w:r>
+        <w:t>UserService</w:t>
+      </w:r>
+      <w:proofErr w:type="spellEnd"/>
+      <w:r>
+        <w:t xml:space="preserve"> class with basic business rules.</w:t>
       </w:r>
     </w:p>
     <w:p>
@@ -53,6 +74,7 @@
       <w:r>
         <w:t xml:space="preserve">Write unit tests using </w:t>
       </w:r>
+      <w:proofErr w:type="spellStart"/>
       <w:r>
         <w:rPr>
           <w:b/>
@@ -60,6 +82,7 @@
         </w:rPr>
         <w:t>MSTest</w:t>
       </w:r>
+      <w:proofErr w:type="spellEnd"/>
       <w:r>
         <w:t xml:space="preserve"> to verify </w:t>
       </w:r>
@@ -129,7 +152,23 @@
           <w:b/>
           <w:bCs/>
         </w:rPr>
-        <w:t>build a UserService class</w:t>
+        <w:t xml:space="preserve">build a </w:t>
+      </w:r>
+      <w:proofErr w:type="spellStart"/>
+      <w:r>
+        <w:rPr>
+          <w:b/>
+          <w:bCs/>
+        </w:rPr>
+        <w:t>UserService</w:t>
+      </w:r>
+      <w:proofErr w:type="spellEnd"/>
+      <w:r>
+        <w:rPr>
+          <w:b/>
+          <w:bCs/>
+        </w:rPr>
+        <w:t xml:space="preserve"> class</w:t>
       </w:r>
       <w:r>
         <w:t xml:space="preserve"> that allows:</w:t>
@@ -175,12 +214,21 @@
       <w:r>
         <w:t xml:space="preserve">Then, write </w:t>
       </w:r>
-      <w:r>
-        <w:rPr>
-          <w:b/>
-          <w:bCs/>
-        </w:rPr>
-        <w:t>MSTest unit tests</w:t>
+      <w:proofErr w:type="spellStart"/>
+      <w:r>
+        <w:rPr>
+          <w:b/>
+          <w:bCs/>
+        </w:rPr>
+        <w:t>MSTest</w:t>
+      </w:r>
+      <w:proofErr w:type="spellEnd"/>
+      <w:r>
+        <w:rPr>
+          <w:b/>
+          <w:bCs/>
+        </w:rPr>
+        <w:t xml:space="preserve"> unit tests</w:t>
       </w:r>
       <w:r>
         <w:t xml:space="preserve"> to validate the </w:t>
@@ -216,6 +264,7 @@
       <w:r>
         <w:t xml:space="preserve">The </w:t>
       </w:r>
+      <w:proofErr w:type="spellStart"/>
       <w:r>
         <w:rPr>
           <w:b/>
@@ -223,6 +272,7 @@
         </w:rPr>
         <w:t>UserService</w:t>
       </w:r>
+      <w:proofErr w:type="spellEnd"/>
       <w:r>
         <w:t xml:space="preserve"> class is designed to work with a user store (database), which you will implement or mock in a later module. For this exercise, </w:t>
       </w:r>
@@ -291,13 +341,22 @@
         <w:pStyle w:val="Heading2"/>
       </w:pPr>
       <w:r>
-        <w:t xml:space="preserve"> Part 1: Implement the UserService Class</w:t>
+        <w:t xml:space="preserve"> Part 1: Implement the </w:t>
+      </w:r>
+      <w:proofErr w:type="spellStart"/>
+      <w:r>
+        <w:t>UserService</w:t>
+      </w:r>
+      <w:proofErr w:type="spellEnd"/>
+      <w:r>
+        <w:t xml:space="preserve"> Class</w:t>
       </w:r>
     </w:p>
     <w:p>
       <w:r>
         <w:t xml:space="preserve">Create a class </w:t>
       </w:r>
+      <w:proofErr w:type="spellStart"/>
       <w:r>
         <w:rPr>
           <w:b/>
@@ -305,6 +364,7 @@
         </w:rPr>
         <w:t>UserService</w:t>
       </w:r>
+      <w:proofErr w:type="spellEnd"/>
       <w:r>
         <w:t xml:space="preserve"> with the following methods:</w:t>
       </w:r>
@@ -328,7 +388,23 @@
           <w:b/>
           <w:bCs/>
         </w:rPr>
-        <w:t>1. RegisterUser(string username, string password, string role)</w:t>
+        <w:t xml:space="preserve">1. </w:t>
+      </w:r>
+      <w:proofErr w:type="spellStart"/>
+      <w:r>
+        <w:rPr>
+          <w:b/>
+          <w:bCs/>
+        </w:rPr>
+        <w:t>RegisterUser</w:t>
+      </w:r>
+      <w:proofErr w:type="spellEnd"/>
+      <w:r>
+        <w:rPr>
+          <w:b/>
+          <w:bCs/>
+        </w:rPr>
+        <w:t>(string username, string password, string role)</w:t>
       </w:r>
     </w:p>
     <w:p>
@@ -475,7 +551,23 @@
           <w:b/>
           <w:bCs/>
         </w:rPr>
-        <w:t>2. LoginUser(string username, string password)</w:t>
+        <w:t xml:space="preserve">2. </w:t>
+      </w:r>
+      <w:proofErr w:type="spellStart"/>
+      <w:r>
+        <w:rPr>
+          <w:b/>
+          <w:bCs/>
+        </w:rPr>
+        <w:t>LoginUser</w:t>
+      </w:r>
+      <w:proofErr w:type="spellEnd"/>
+      <w:r>
+        <w:rPr>
+          <w:b/>
+          <w:bCs/>
+        </w:rPr>
+        <w:t>(string username, string password)</w:t>
       </w:r>
     </w:p>
     <w:p>
@@ -609,7 +701,39 @@
           <w:b/>
           <w:bCs/>
         </w:rPr>
-        <w:t>3. HasAccess(string username, string requiredRole)</w:t>
+        <w:t xml:space="preserve">3. </w:t>
+      </w:r>
+      <w:proofErr w:type="spellStart"/>
+      <w:r>
+        <w:rPr>
+          <w:b/>
+          <w:bCs/>
+        </w:rPr>
+        <w:t>HasAccess</w:t>
+      </w:r>
+      <w:proofErr w:type="spellEnd"/>
+      <w:r>
+        <w:rPr>
+          <w:b/>
+          <w:bCs/>
+        </w:rPr>
+        <w:t xml:space="preserve">(string username, string </w:t>
+      </w:r>
+      <w:proofErr w:type="spellStart"/>
+      <w:r>
+        <w:rPr>
+          <w:b/>
+          <w:bCs/>
+        </w:rPr>
+        <w:t>requiredRole</w:t>
+      </w:r>
+      <w:proofErr w:type="spellEnd"/>
+      <w:r>
+        <w:rPr>
+          <w:b/>
+          <w:bCs/>
+        </w:rPr>
+        <w:t>)</w:t>
       </w:r>
     </w:p>
     <w:p>
@@ -669,8 +793,13 @@
         <w:t xml:space="preserve">️ </w:t>
       </w:r>
       <w:r>
-        <w:t>and their role matches requiredRole</w:t>
-      </w:r>
+        <w:t xml:space="preserve">and their role matches </w:t>
+      </w:r>
+      <w:proofErr w:type="spellStart"/>
+      <w:r>
+        <w:t>requiredRole</w:t>
+      </w:r>
+      <w:proofErr w:type="spellEnd"/>
       <w:r>
         <w:br/>
       </w:r>
@@ -692,7 +821,15 @@
         <w:pStyle w:val="Heading2"/>
       </w:pPr>
       <w:r>
-        <w:t xml:space="preserve"> Part 2: Write Unit Tests (MSTest)</w:t>
+        <w:t xml:space="preserve"> Part 2: Write Unit Tests (</w:t>
+      </w:r>
+      <w:proofErr w:type="spellStart"/>
+      <w:r>
+        <w:t>MSTest</w:t>
+      </w:r>
+      <w:proofErr w:type="spellEnd"/>
+      <w:r>
+        <w:t>)</w:t>
       </w:r>
     </w:p>
     <w:p>
@@ -725,8 +862,13 @@
           <w:numId w:val="12"/>
         </w:numPr>
       </w:pPr>
-      <w:r>
-        <w:t>RegisterUser Tests</w:t>
+      <w:proofErr w:type="spellStart"/>
+      <w:r>
+        <w:t>RegisterUser</w:t>
+      </w:r>
+      <w:proofErr w:type="spellEnd"/>
+      <w:r>
+        <w:t xml:space="preserve"> Tests</w:t>
       </w:r>
     </w:p>
     <w:p>
@@ -838,8 +980,13 @@
           <w:numId w:val="12"/>
         </w:numPr>
       </w:pPr>
-      <w:r>
-        <w:t>LoginUser Tests</w:t>
+      <w:proofErr w:type="spellStart"/>
+      <w:r>
+        <w:t>LoginUser</w:t>
+      </w:r>
+      <w:proofErr w:type="spellEnd"/>
+      <w:r>
+        <w:t xml:space="preserve"> Tests</w:t>
       </w:r>
     </w:p>
     <w:p>
@@ -925,8 +1072,13 @@
           <w:numId w:val="12"/>
         </w:numPr>
       </w:pPr>
-      <w:r>
-        <w:t>HasAccess Tests</w:t>
+      <w:proofErr w:type="spellStart"/>
+      <w:r>
+        <w:t>HasAccess</w:t>
+      </w:r>
+      <w:proofErr w:type="spellEnd"/>
+      <w:r>
+        <w:t xml:space="preserve"> Tests</w:t>
       </w:r>
     </w:p>
     <w:p>
@@ -981,7 +1133,15 @@
         </w:numPr>
       </w:pPr>
       <w:r>
-        <w:t>Use [TestMethod] for each test.</w:t>
+        <w:t>Use [</w:t>
+      </w:r>
+      <w:proofErr w:type="spellStart"/>
+      <w:r>
+        <w:t>TestMethod</w:t>
+      </w:r>
+      <w:proofErr w:type="spellEnd"/>
+      <w:r>
+        <w:t>] for each test.</w:t>
       </w:r>
     </w:p>
     <w:p>
@@ -1000,13 +1160,41 @@
       <w:r>
         <w:t>[</w:t>
       </w:r>
+      <w:proofErr w:type="spellStart"/>
       <w:r>
         <w:rPr>
           <w:rFonts w:ascii="Courier New" w:hAnsi="Courier New" w:cs="Courier New"/>
           <w:b/>
           <w:bCs/>
         </w:rPr>
-        <w:t xml:space="preserve">ExpectedException(typeof(...))] </w:t>
+        <w:t>ExpectedException</w:t>
+      </w:r>
+      <w:proofErr w:type="spellEnd"/>
+      <w:r>
+        <w:rPr>
+          <w:rFonts w:ascii="Courier New" w:hAnsi="Courier New" w:cs="Courier New"/>
+          <w:b/>
+          <w:bCs/>
+        </w:rPr>
+        <w:t>(</w:t>
+      </w:r>
+      <w:proofErr w:type="spellStart"/>
+      <w:r>
+        <w:rPr>
+          <w:rFonts w:ascii="Courier New" w:hAnsi="Courier New" w:cs="Courier New"/>
+          <w:b/>
+          <w:bCs/>
+        </w:rPr>
+        <w:t>typeof</w:t>
+      </w:r>
+      <w:proofErr w:type="spellEnd"/>
+      <w:r>
+        <w:rPr>
+          <w:rFonts w:ascii="Courier New" w:hAnsi="Courier New" w:cs="Courier New"/>
+          <w:b/>
+          <w:bCs/>
+        </w:rPr>
+        <w:t xml:space="preserve">(...))] </w:t>
       </w:r>
       <w:r>
         <w:t>or</w:t>
@@ -1027,13 +1215,23 @@
         </w:rPr>
         <w:tab/>
       </w:r>
+      <w:proofErr w:type="spellStart"/>
       <w:r>
         <w:rPr>
           <w:rFonts w:ascii="Courier New" w:hAnsi="Courier New" w:cs="Courier New"/>
           <w:b/>
           <w:bCs/>
         </w:rPr>
-        <w:t>Assert.ThrowsException&lt;T&gt;()</w:t>
+        <w:t>Assert.ThrowsException</w:t>
+      </w:r>
+      <w:proofErr w:type="spellEnd"/>
+      <w:r>
+        <w:rPr>
+          <w:rFonts w:ascii="Courier New" w:hAnsi="Courier New" w:cs="Courier New"/>
+          <w:b/>
+          <w:bCs/>
+        </w:rPr>
+        <w:t>&lt;T&gt;()</w:t>
       </w:r>
       <w:r>
         <w:t xml:space="preserve"> </w:t>
@@ -1063,7 +1261,23 @@
           <w:b/>
           <w:bCs/>
         </w:rPr>
-        <w:t>[TestInitialize]</w:t>
+        <w:t>[</w:t>
+      </w:r>
+      <w:proofErr w:type="spellStart"/>
+      <w:r>
+        <w:rPr>
+          <w:b/>
+          <w:bCs/>
+        </w:rPr>
+        <w:t>TestInitialize</w:t>
+      </w:r>
+      <w:proofErr w:type="spellEnd"/>
+      <w:r>
+        <w:rPr>
+          <w:b/>
+          <w:bCs/>
+        </w:rPr>
+        <w:t>]</w:t>
       </w:r>
       <w:r>
         <w:t xml:space="preserve"> to set up fresh data before each test.</w:t>
@@ -1079,6 +1293,7 @@
       <w:r>
         <w:t xml:space="preserve">Use </w:t>
       </w:r>
+      <w:proofErr w:type="spellStart"/>
       <w:r>
         <w:rPr>
           <w:b/>
@@ -1086,9 +1301,11 @@
         </w:rPr>
         <w:t>Assert.IsTrue</w:t>
       </w:r>
+      <w:proofErr w:type="spellEnd"/>
       <w:r>
         <w:t xml:space="preserve">(...), </w:t>
       </w:r>
+      <w:proofErr w:type="spellStart"/>
       <w:r>
         <w:rPr>
           <w:b/>
@@ -1096,9 +1313,11 @@
         </w:rPr>
         <w:t>Assert.IsFalse</w:t>
       </w:r>
+      <w:proofErr w:type="spellEnd"/>
       <w:r>
         <w:t xml:space="preserve">(...), </w:t>
       </w:r>
+      <w:proofErr w:type="spellStart"/>
       <w:r>
         <w:rPr>
           <w:b/>
@@ -1106,6 +1325,7 @@
         </w:rPr>
         <w:t>Assert.AreEqual</w:t>
       </w:r>
+      <w:proofErr w:type="spellEnd"/>
       <w:r>
         <w:t>(...) where appropriate.</w:t>
       </w:r>
@@ -1144,7 +1364,29 @@
           <w:szCs w:val="19"/>
           <w:lang w:eastAsia="en-US"/>
         </w:rPr>
-        <w:t>[TestClass]</w:t>
+        <w:t>[</w:t>
+      </w:r>
+      <w:proofErr w:type="spellStart"/>
+      <w:r>
+        <w:rPr>
+          <w:rFonts w:ascii="Consolas" w:hAnsi="Consolas" w:cs="Consolas"/>
+          <w:color w:val="000000"/>
+          <w:sz w:val="19"/>
+          <w:szCs w:val="19"/>
+          <w:lang w:eastAsia="en-US"/>
+        </w:rPr>
+        <w:t>TestClass</w:t>
+      </w:r>
+      <w:proofErr w:type="spellEnd"/>
+      <w:r>
+        <w:rPr>
+          <w:rFonts w:ascii="Consolas" w:hAnsi="Consolas" w:cs="Consolas"/>
+          <w:color w:val="000000"/>
+          <w:sz w:val="19"/>
+          <w:szCs w:val="19"/>
+          <w:lang w:eastAsia="en-US"/>
+        </w:rPr>
+        <w:t>]</w:t>
       </w:r>
     </w:p>
     <w:p>
@@ -1203,6 +1445,7 @@
         </w:rPr>
         <w:t xml:space="preserve"> </w:t>
       </w:r>
+      <w:proofErr w:type="spellStart"/>
       <w:r>
         <w:rPr>
           <w:rFonts w:ascii="Consolas" w:hAnsi="Consolas" w:cs="Consolas"/>
@@ -1211,7 +1454,18 @@
           <w:szCs w:val="19"/>
           <w:lang w:eastAsia="en-US"/>
         </w:rPr>
-        <w:t xml:space="preserve">UserServiceTests </w:t>
+        <w:t>UserServiceTests</w:t>
+      </w:r>
+      <w:proofErr w:type="spellEnd"/>
+      <w:r>
+        <w:rPr>
+          <w:rFonts w:ascii="Consolas" w:hAnsi="Consolas" w:cs="Consolas"/>
+          <w:color w:val="2B91AF"/>
+          <w:sz w:val="19"/>
+          <w:szCs w:val="19"/>
+          <w:lang w:eastAsia="en-US"/>
+        </w:rPr>
+        <w:t xml:space="preserve"> </w:t>
       </w:r>
       <w:r>
         <w:rPr>
@@ -1268,7 +1522,51 @@
           <w:szCs w:val="19"/>
           <w:lang w:eastAsia="en-US"/>
         </w:rPr>
-        <w:t xml:space="preserve"> UserService userService;</w:t>
+        <w:t xml:space="preserve"> </w:t>
+      </w:r>
+      <w:proofErr w:type="spellStart"/>
+      <w:r>
+        <w:rPr>
+          <w:rFonts w:ascii="Consolas" w:hAnsi="Consolas" w:cs="Consolas"/>
+          <w:color w:val="000000"/>
+          <w:sz w:val="19"/>
+          <w:szCs w:val="19"/>
+          <w:lang w:eastAsia="en-US"/>
+        </w:rPr>
+        <w:t>UserService</w:t>
+      </w:r>
+      <w:proofErr w:type="spellEnd"/>
+      <w:r>
+        <w:rPr>
+          <w:rFonts w:ascii="Consolas" w:hAnsi="Consolas" w:cs="Consolas"/>
+          <w:color w:val="000000"/>
+          <w:sz w:val="19"/>
+          <w:szCs w:val="19"/>
+          <w:lang w:eastAsia="en-US"/>
+        </w:rPr>
+        <w:t xml:space="preserve"> </w:t>
+      </w:r>
+      <w:proofErr w:type="spellStart"/>
+      <w:r>
+        <w:rPr>
+          <w:rFonts w:ascii="Consolas" w:hAnsi="Consolas" w:cs="Consolas"/>
+          <w:color w:val="000000"/>
+          <w:sz w:val="19"/>
+          <w:szCs w:val="19"/>
+          <w:lang w:eastAsia="en-US"/>
+        </w:rPr>
+        <w:t>userService</w:t>
+      </w:r>
+      <w:proofErr w:type="spellEnd"/>
+      <w:r>
+        <w:rPr>
+          <w:rFonts w:ascii="Consolas" w:hAnsi="Consolas" w:cs="Consolas"/>
+          <w:color w:val="000000"/>
+          <w:sz w:val="19"/>
+          <w:szCs w:val="19"/>
+          <w:lang w:eastAsia="en-US"/>
+        </w:rPr>
+        <w:t>;</w:t>
       </w:r>
     </w:p>
     <w:p>
@@ -1312,7 +1610,29 @@
           <w:szCs w:val="19"/>
           <w:lang w:eastAsia="en-US"/>
         </w:rPr>
-        <w:t xml:space="preserve">    [TestInitialize]</w:t>
+        <w:t xml:space="preserve">    [</w:t>
+      </w:r>
+      <w:proofErr w:type="spellStart"/>
+      <w:r>
+        <w:rPr>
+          <w:rFonts w:ascii="Consolas" w:hAnsi="Consolas" w:cs="Consolas"/>
+          <w:color w:val="000000"/>
+          <w:sz w:val="19"/>
+          <w:szCs w:val="19"/>
+          <w:lang w:eastAsia="en-US"/>
+        </w:rPr>
+        <w:t>TestInitialize</w:t>
+      </w:r>
+      <w:proofErr w:type="spellEnd"/>
+      <w:r>
+        <w:rPr>
+          <w:rFonts w:ascii="Consolas" w:hAnsi="Consolas" w:cs="Consolas"/>
+          <w:color w:val="000000"/>
+          <w:sz w:val="19"/>
+          <w:szCs w:val="19"/>
+          <w:lang w:eastAsia="en-US"/>
+        </w:rPr>
+        <w:t>]</w:t>
       </w:r>
     </w:p>
     <w:p>
@@ -1406,7 +1726,29 @@
           <w:szCs w:val="19"/>
           <w:lang w:eastAsia="en-US"/>
         </w:rPr>
-        <w:t xml:space="preserve">        userService = </w:t>
+        <w:t xml:space="preserve">        </w:t>
+      </w:r>
+      <w:proofErr w:type="spellStart"/>
+      <w:r>
+        <w:rPr>
+          <w:rFonts w:ascii="Consolas" w:hAnsi="Consolas" w:cs="Consolas"/>
+          <w:color w:val="000000"/>
+          <w:sz w:val="19"/>
+          <w:szCs w:val="19"/>
+          <w:lang w:eastAsia="en-US"/>
+        </w:rPr>
+        <w:t>userService</w:t>
+      </w:r>
+      <w:proofErr w:type="spellEnd"/>
+      <w:r>
+        <w:rPr>
+          <w:rFonts w:ascii="Consolas" w:hAnsi="Consolas" w:cs="Consolas"/>
+          <w:color w:val="000000"/>
+          <w:sz w:val="19"/>
+          <w:szCs w:val="19"/>
+          <w:lang w:eastAsia="en-US"/>
+        </w:rPr>
+        <w:t xml:space="preserve"> = </w:t>
       </w:r>
       <w:r>
         <w:rPr>
@@ -1426,7 +1768,29 @@
           <w:szCs w:val="19"/>
           <w:lang w:eastAsia="en-US"/>
         </w:rPr>
-        <w:t xml:space="preserve"> UserService();</w:t>
+        <w:t xml:space="preserve"> </w:t>
+      </w:r>
+      <w:proofErr w:type="spellStart"/>
+      <w:r>
+        <w:rPr>
+          <w:rFonts w:ascii="Consolas" w:hAnsi="Consolas" w:cs="Consolas"/>
+          <w:color w:val="000000"/>
+          <w:sz w:val="19"/>
+          <w:szCs w:val="19"/>
+          <w:lang w:eastAsia="en-US"/>
+        </w:rPr>
+        <w:t>UserService</w:t>
+      </w:r>
+      <w:proofErr w:type="spellEnd"/>
+      <w:r>
+        <w:rPr>
+          <w:rFonts w:ascii="Consolas" w:hAnsi="Consolas" w:cs="Consolas"/>
+          <w:color w:val="000000"/>
+          <w:sz w:val="19"/>
+          <w:szCs w:val="19"/>
+          <w:lang w:eastAsia="en-US"/>
+        </w:rPr>
+        <w:t>();</w:t>
       </w:r>
     </w:p>
     <w:p>
@@ -1497,7 +1861,29 @@
           <w:szCs w:val="19"/>
           <w:lang w:eastAsia="en-US"/>
         </w:rPr>
-        <w:t xml:space="preserve">    [TestMethod]</w:t>
+        <w:t xml:space="preserve">    [</w:t>
+      </w:r>
+      <w:proofErr w:type="spellStart"/>
+      <w:r>
+        <w:rPr>
+          <w:rFonts w:ascii="Consolas" w:hAnsi="Consolas" w:cs="Consolas"/>
+          <w:color w:val="000000"/>
+          <w:sz w:val="19"/>
+          <w:szCs w:val="19"/>
+          <w:lang w:eastAsia="en-US"/>
+        </w:rPr>
+        <w:t>TestMethod</w:t>
+      </w:r>
+      <w:proofErr w:type="spellEnd"/>
+      <w:r>
+        <w:rPr>
+          <w:rFonts w:ascii="Consolas" w:hAnsi="Consolas" w:cs="Consolas"/>
+          <w:color w:val="000000"/>
+          <w:sz w:val="19"/>
+          <w:szCs w:val="19"/>
+          <w:lang w:eastAsia="en-US"/>
+        </w:rPr>
+        <w:t>]</w:t>
       </w:r>
     </w:p>
     <w:p>
@@ -1564,7 +1950,29 @@
           <w:szCs w:val="19"/>
           <w:lang w:eastAsia="en-US"/>
         </w:rPr>
-        <w:t xml:space="preserve"> RegisterUser_WithValidInput_AddsUserSuccessfully()     {</w:t>
+        <w:t xml:space="preserve"> </w:t>
+      </w:r>
+      <w:proofErr w:type="spellStart"/>
+      <w:r>
+        <w:rPr>
+          <w:rFonts w:ascii="Consolas" w:hAnsi="Consolas" w:cs="Consolas"/>
+          <w:color w:val="000000"/>
+          <w:sz w:val="19"/>
+          <w:szCs w:val="19"/>
+          <w:lang w:eastAsia="en-US"/>
+        </w:rPr>
+        <w:t>RegisterUser_WithValidInput_AddsUserSuccessfully</w:t>
+      </w:r>
+      <w:proofErr w:type="spellEnd"/>
+      <w:r>
+        <w:rPr>
+          <w:rFonts w:ascii="Consolas" w:hAnsi="Consolas" w:cs="Consolas"/>
+          <w:color w:val="000000"/>
+          <w:sz w:val="19"/>
+          <w:szCs w:val="19"/>
+          <w:lang w:eastAsia="en-US"/>
+        </w:rPr>
+        <w:t>()     {</w:t>
       </w:r>
     </w:p>
     <w:p>
@@ -1850,6 +2258,7 @@
         </w:rPr>
         <w:t xml:space="preserve">Install-Package </w:t>
       </w:r>
+      <w:proofErr w:type="spellStart"/>
       <w:r>
         <w:rPr>
           <w:b/>
@@ -1859,6 +2268,7 @@
         </w:rPr>
         <w:t>FluentAssertions</w:t>
       </w:r>
+      <w:proofErr w:type="spellEnd"/>
     </w:p>
     <w:p>
       <w:pPr>
@@ -1875,6 +2285,7 @@
         <w:t xml:space="preserve">Install-Package </w:t>
       </w:r>
       <w:bookmarkStart w:id="0" w:name="_Hlk193104463"/>
+      <w:proofErr w:type="spellStart"/>
       <w:r>
         <w:rPr>
           <w:b/>
@@ -1885,6 +2296,7 @@
         <w:t>RestSharp</w:t>
       </w:r>
       <w:bookmarkEnd w:id="0"/>
+      <w:proofErr w:type="spellEnd"/>
     </w:p>
     <w:p>
       <w:pPr>
@@ -1901,6 +2313,7 @@
           <w:szCs w:val="24"/>
         </w:rPr>
       </w:pPr>
+      <w:proofErr w:type="spellStart"/>
       <w:r>
         <w:rPr>
           <w:b/>
@@ -1910,6 +2323,7 @@
         </w:rPr>
         <w:t>FluentAssertions</w:t>
       </w:r>
+      <w:proofErr w:type="spellEnd"/>
       <w:r>
         <w:rPr>
           <w:b/>
@@ -1926,6 +2340,7 @@
         </w:rPr>
         <w:t xml:space="preserve">is used in the test class and </w:t>
       </w:r>
+      <w:proofErr w:type="spellStart"/>
       <w:r>
         <w:rPr>
           <w:b/>
@@ -1935,6 +2350,7 @@
         </w:rPr>
         <w:t>RestSharp</w:t>
       </w:r>
+      <w:proofErr w:type="spellEnd"/>
       <w:r>
         <w:rPr>
           <w:b/>
@@ -1949,7 +2365,39 @@
           <w:sz w:val="24"/>
           <w:szCs w:val="24"/>
         </w:rPr>
-        <w:t xml:space="preserve"> in the UserService class (seen below) to fetch data from an API end point.</w:t>
+        <w:t xml:space="preserve"> in the </w:t>
+      </w:r>
+      <w:proofErr w:type="spellStart"/>
+      <w:r>
+        <w:rPr>
+          <w:sz w:val="24"/>
+          <w:szCs w:val="24"/>
+        </w:rPr>
+        <w:t>UserService</w:t>
+      </w:r>
+      <w:proofErr w:type="spellEnd"/>
+      <w:r>
+        <w:rPr>
+          <w:sz w:val="24"/>
+          <w:szCs w:val="24"/>
+        </w:rPr>
+        <w:t xml:space="preserve"> class (</w:t>
+      </w:r>
+      <w:proofErr w:type="spellStart"/>
+      <w:r>
+        <w:rPr>
+          <w:sz w:val="24"/>
+          <w:szCs w:val="24"/>
+        </w:rPr>
+        <w:t>seen</w:t>
+      </w:r>
+      <w:proofErr w:type="spellEnd"/>
+      <w:r>
+        <w:rPr>
+          <w:sz w:val="24"/>
+          <w:szCs w:val="24"/>
+        </w:rPr>
+        <w:t xml:space="preserve"> below) to fetch data from an API end point.</w:t>
       </w:r>
     </w:p>
     <w:p/>
@@ -1974,6 +2422,7 @@
       <w:r>
         <w:t xml:space="preserve">Create a new class called </w:t>
       </w:r>
+      <w:proofErr w:type="spellStart"/>
       <w:r>
         <w:rPr>
           <w:b/>
@@ -1981,6 +2430,7 @@
         </w:rPr>
         <w:t>UserService</w:t>
       </w:r>
+      <w:proofErr w:type="spellEnd"/>
       <w:r>
         <w:t xml:space="preserve"> </w:t>
       </w:r>
@@ -2015,7 +2465,33 @@
           <w:szCs w:val="20"/>
           <w:lang w:eastAsia="en-US"/>
         </w:rPr>
-        <w:t xml:space="preserve"> System.Threading.Tasks;</w:t>
+        <w:t xml:space="preserve"> </w:t>
+      </w:r>
+      <w:proofErr w:type="spellStart"/>
+      <w:r>
+        <w:rPr>
+          <w:rFonts w:ascii="Consolas" w:hAnsi="Consolas" w:cs="Consolas"/>
+          <w:b/>
+          <w:bCs/>
+          <w:color w:val="000000"/>
+          <w:sz w:val="20"/>
+          <w:szCs w:val="20"/>
+          <w:lang w:eastAsia="en-US"/>
+        </w:rPr>
+        <w:t>System.Threading.Tasks</w:t>
+      </w:r>
+      <w:proofErr w:type="spellEnd"/>
+      <w:r>
+        <w:rPr>
+          <w:rFonts w:ascii="Consolas" w:hAnsi="Consolas" w:cs="Consolas"/>
+          <w:b/>
+          <w:bCs/>
+          <w:color w:val="000000"/>
+          <w:sz w:val="20"/>
+          <w:szCs w:val="20"/>
+          <w:lang w:eastAsia="en-US"/>
+        </w:rPr>
+        <w:t>;</w:t>
       </w:r>
     </w:p>
     <w:p>
@@ -2058,7 +2534,33 @@
           <w:szCs w:val="20"/>
           <w:lang w:eastAsia="en-US"/>
         </w:rPr>
-        <w:t xml:space="preserve"> RestSharp;</w:t>
+        <w:t xml:space="preserve"> </w:t>
+      </w:r>
+      <w:proofErr w:type="spellStart"/>
+      <w:r>
+        <w:rPr>
+          <w:rFonts w:ascii="Consolas" w:hAnsi="Consolas" w:cs="Consolas"/>
+          <w:b/>
+          <w:bCs/>
+          <w:color w:val="000000"/>
+          <w:sz w:val="20"/>
+          <w:szCs w:val="20"/>
+          <w:lang w:eastAsia="en-US"/>
+        </w:rPr>
+        <w:t>RestSharp</w:t>
+      </w:r>
+      <w:proofErr w:type="spellEnd"/>
+      <w:r>
+        <w:rPr>
+          <w:rFonts w:ascii="Consolas" w:hAnsi="Consolas" w:cs="Consolas"/>
+          <w:b/>
+          <w:bCs/>
+          <w:color w:val="000000"/>
+          <w:sz w:val="20"/>
+          <w:szCs w:val="20"/>
+          <w:lang w:eastAsia="en-US"/>
+        </w:rPr>
+        <w:t>;</w:t>
       </w:r>
     </w:p>
     <w:p>
@@ -2144,7 +2646,33 @@
           <w:szCs w:val="20"/>
           <w:lang w:eastAsia="en-US"/>
         </w:rPr>
-        <w:t xml:space="preserve"> System.Net.Http;</w:t>
+        <w:t xml:space="preserve"> </w:t>
+      </w:r>
+      <w:proofErr w:type="spellStart"/>
+      <w:r>
+        <w:rPr>
+          <w:rFonts w:ascii="Consolas" w:hAnsi="Consolas" w:cs="Consolas"/>
+          <w:b/>
+          <w:bCs/>
+          <w:color w:val="000000"/>
+          <w:sz w:val="20"/>
+          <w:szCs w:val="20"/>
+          <w:lang w:eastAsia="en-US"/>
+        </w:rPr>
+        <w:t>System.Net.Http</w:t>
+      </w:r>
+      <w:proofErr w:type="spellEnd"/>
+      <w:r>
+        <w:rPr>
+          <w:rFonts w:ascii="Consolas" w:hAnsi="Consolas" w:cs="Consolas"/>
+          <w:b/>
+          <w:bCs/>
+          <w:color w:val="000000"/>
+          <w:sz w:val="20"/>
+          <w:szCs w:val="20"/>
+          <w:lang w:eastAsia="en-US"/>
+        </w:rPr>
+        <w:t>;</w:t>
       </w:r>
     </w:p>
     <w:p>
@@ -2228,6 +2756,7 @@
         </w:rPr>
         <w:t xml:space="preserve"> </w:t>
       </w:r>
+      <w:proofErr w:type="spellStart"/>
       <w:r>
         <w:rPr>
           <w:rFonts w:ascii="Consolas" w:hAnsi="Consolas" w:cs="Consolas"/>
@@ -2240,6 +2769,7 @@
         </w:rPr>
         <w:t>UserService</w:t>
       </w:r>
+      <w:proofErr w:type="spellEnd"/>
     </w:p>
     <w:p>
       <w:pPr>
@@ -2344,7 +2874,33 @@
           <w:szCs w:val="20"/>
           <w:lang w:eastAsia="en-US"/>
         </w:rPr>
-        <w:t xml:space="preserve"> RestClient _client;</w:t>
+        <w:t xml:space="preserve"> </w:t>
+      </w:r>
+      <w:proofErr w:type="spellStart"/>
+      <w:r>
+        <w:rPr>
+          <w:rFonts w:ascii="Consolas" w:hAnsi="Consolas" w:cs="Consolas"/>
+          <w:b/>
+          <w:bCs/>
+          <w:color w:val="000000"/>
+          <w:sz w:val="20"/>
+          <w:szCs w:val="20"/>
+          <w:lang w:eastAsia="en-US"/>
+        </w:rPr>
+        <w:t>RestClient</w:t>
+      </w:r>
+      <w:proofErr w:type="spellEnd"/>
+      <w:r>
+        <w:rPr>
+          <w:rFonts w:ascii="Consolas" w:hAnsi="Consolas" w:cs="Consolas"/>
+          <w:b/>
+          <w:bCs/>
+          <w:color w:val="000000"/>
+          <w:sz w:val="20"/>
+          <w:szCs w:val="20"/>
+          <w:lang w:eastAsia="en-US"/>
+        </w:rPr>
+        <w:t xml:space="preserve"> _client;</w:t>
       </w:r>
     </w:p>
     <w:p>
@@ -2414,20 +2970,46 @@
           <w:szCs w:val="20"/>
           <w:lang w:eastAsia="en-US"/>
         </w:rPr>
-        <w:t xml:space="preserve"> UserService()</w:t>
-      </w:r>
-      <w:r>
-        <w:rPr>
-          <w:rFonts w:ascii="Consolas" w:hAnsi="Consolas" w:cs="Consolas"/>
-          <w:b/>
-          <w:bCs/>
-          <w:color w:val="000000"/>
-          <w:sz w:val="20"/>
-          <w:szCs w:val="20"/>
-          <w:lang w:eastAsia="en-US"/>
-        </w:rPr>
         <w:t xml:space="preserve"> </w:t>
       </w:r>
+      <w:proofErr w:type="spellStart"/>
+      <w:r>
+        <w:rPr>
+          <w:rFonts w:ascii="Consolas" w:hAnsi="Consolas" w:cs="Consolas"/>
+          <w:b/>
+          <w:bCs/>
+          <w:color w:val="000000"/>
+          <w:sz w:val="20"/>
+          <w:szCs w:val="20"/>
+          <w:lang w:eastAsia="en-US"/>
+        </w:rPr>
+        <w:t>UserService</w:t>
+      </w:r>
+      <w:proofErr w:type="spellEnd"/>
+      <w:r>
+        <w:rPr>
+          <w:rFonts w:ascii="Consolas" w:hAnsi="Consolas" w:cs="Consolas"/>
+          <w:b/>
+          <w:bCs/>
+          <w:color w:val="000000"/>
+          <w:sz w:val="20"/>
+          <w:szCs w:val="20"/>
+          <w:lang w:eastAsia="en-US"/>
+        </w:rPr>
+        <w:t>()</w:t>
+      </w:r>
+      <w:r>
+        <w:rPr>
+          <w:rFonts w:ascii="Consolas" w:hAnsi="Consolas" w:cs="Consolas"/>
+          <w:b/>
+          <w:bCs/>
+          <w:color w:val="000000"/>
+          <w:sz w:val="20"/>
+          <w:szCs w:val="20"/>
+          <w:lang w:eastAsia="en-US"/>
+        </w:rPr>
+        <w:t xml:space="preserve"> </w:t>
+      </w:r>
       <w:r>
         <w:rPr>
           <w:rFonts w:ascii="Consolas" w:hAnsi="Consolas" w:cs="Consolas"/>
@@ -2491,7 +3073,33 @@
           <w:szCs w:val="20"/>
           <w:lang w:eastAsia="en-US"/>
         </w:rPr>
-        <w:t xml:space="preserve"> RestClient(</w:t>
+        <w:t xml:space="preserve"> </w:t>
+      </w:r>
+      <w:proofErr w:type="spellStart"/>
+      <w:r>
+        <w:rPr>
+          <w:rFonts w:ascii="Consolas" w:hAnsi="Consolas" w:cs="Consolas"/>
+          <w:b/>
+          <w:bCs/>
+          <w:color w:val="000000"/>
+          <w:sz w:val="20"/>
+          <w:szCs w:val="20"/>
+          <w:lang w:eastAsia="en-US"/>
+        </w:rPr>
+        <w:t>RestClient</w:t>
+      </w:r>
+      <w:proofErr w:type="spellEnd"/>
+      <w:r>
+        <w:rPr>
+          <w:rFonts w:ascii="Consolas" w:hAnsi="Consolas" w:cs="Consolas"/>
+          <w:b/>
+          <w:bCs/>
+          <w:color w:val="000000"/>
+          <w:sz w:val="20"/>
+          <w:szCs w:val="20"/>
+          <w:lang w:eastAsia="en-US"/>
+        </w:rPr>
+        <w:t>(</w:t>
       </w:r>
       <w:r>
         <w:rPr>
@@ -2515,7 +3123,31 @@
           <w:szCs w:val="20"/>
           <w:lang w:eastAsia="en-US"/>
         </w:rPr>
-        <w:t>https://mike-jov1.onrender.com</w:t>
+        <w:t>https://</w:t>
+      </w:r>
+      <w:r>
+        <w:rPr>
+          <w:rFonts w:ascii="Consolas" w:hAnsi="Consolas" w:cs="Consolas"/>
+          <w:b/>
+          <w:bCs/>
+          <w:color w:val="A31515"/>
+          <w:sz w:val="20"/>
+          <w:szCs w:val="20"/>
+          <w:lang w:eastAsia="en-US"/>
+        </w:rPr>
+        <w:t>tx100</w:t>
+      </w:r>
+      <w:r>
+        <w:rPr>
+          <w:rFonts w:ascii="Consolas" w:hAnsi="Consolas" w:cs="Consolas"/>
+          <w:b/>
+          <w:bCs/>
+          <w:color w:val="A31515"/>
+          <w:sz w:val="20"/>
+          <w:szCs w:val="20"/>
+          <w:lang w:eastAsia="en-US"/>
+        </w:rPr>
+        <w:t>.onrender.com</w:t>
       </w:r>
       <w:r>
         <w:rPr>
@@ -2699,7 +3331,33 @@
           <w:szCs w:val="20"/>
           <w:lang w:eastAsia="en-US"/>
         </w:rPr>
-        <w:t>&gt; GetCustomers()</w:t>
+        <w:t xml:space="preserve">&gt; </w:t>
+      </w:r>
+      <w:proofErr w:type="spellStart"/>
+      <w:r>
+        <w:rPr>
+          <w:rFonts w:ascii="Consolas" w:hAnsi="Consolas" w:cs="Consolas"/>
+          <w:b/>
+          <w:bCs/>
+          <w:color w:val="000000"/>
+          <w:sz w:val="20"/>
+          <w:szCs w:val="20"/>
+          <w:lang w:eastAsia="en-US"/>
+        </w:rPr>
+        <w:t>GetCustomers</w:t>
+      </w:r>
+      <w:proofErr w:type="spellEnd"/>
+      <w:r>
+        <w:rPr>
+          <w:rFonts w:ascii="Consolas" w:hAnsi="Consolas" w:cs="Consolas"/>
+          <w:b/>
+          <w:bCs/>
+          <w:color w:val="000000"/>
+          <w:sz w:val="20"/>
+          <w:szCs w:val="20"/>
+          <w:lang w:eastAsia="en-US"/>
+        </w:rPr>
+        <w:t>()</w:t>
       </w:r>
       <w:r>
         <w:rPr>
@@ -2802,7 +3460,33 @@
           <w:szCs w:val="20"/>
           <w:lang w:eastAsia="en-US"/>
         </w:rPr>
-        <w:t xml:space="preserve"> RestRequest(</w:t>
+        <w:t xml:space="preserve"> </w:t>
+      </w:r>
+      <w:proofErr w:type="spellStart"/>
+      <w:r>
+        <w:rPr>
+          <w:rFonts w:ascii="Consolas" w:hAnsi="Consolas" w:cs="Consolas"/>
+          <w:b/>
+          <w:bCs/>
+          <w:color w:val="000000"/>
+          <w:sz w:val="20"/>
+          <w:szCs w:val="20"/>
+          <w:lang w:eastAsia="en-US"/>
+        </w:rPr>
+        <w:t>RestRequest</w:t>
+      </w:r>
+      <w:proofErr w:type="spellEnd"/>
+      <w:r>
+        <w:rPr>
+          <w:rFonts w:ascii="Consolas" w:hAnsi="Consolas" w:cs="Consolas"/>
+          <w:b/>
+          <w:bCs/>
+          <w:color w:val="000000"/>
+          <w:sz w:val="20"/>
+          <w:szCs w:val="20"/>
+          <w:lang w:eastAsia="en-US"/>
+        </w:rPr>
+        <w:t>(</w:t>
       </w:r>
       <w:r>
         <w:rPr>
@@ -2826,7 +3510,33 @@
           <w:szCs w:val="20"/>
           <w:lang w:eastAsia="en-US"/>
         </w:rPr>
-        <w:t>, Method.Get);</w:t>
+        <w:t xml:space="preserve">, </w:t>
+      </w:r>
+      <w:proofErr w:type="spellStart"/>
+      <w:r>
+        <w:rPr>
+          <w:rFonts w:ascii="Consolas" w:hAnsi="Consolas" w:cs="Consolas"/>
+          <w:b/>
+          <w:bCs/>
+          <w:color w:val="000000"/>
+          <w:sz w:val="20"/>
+          <w:szCs w:val="20"/>
+          <w:lang w:eastAsia="en-US"/>
+        </w:rPr>
+        <w:t>Method.Get</w:t>
+      </w:r>
+      <w:proofErr w:type="spellEnd"/>
+      <w:r>
+        <w:rPr>
+          <w:rFonts w:ascii="Consolas" w:hAnsi="Consolas" w:cs="Consolas"/>
+          <w:b/>
+          <w:bCs/>
+          <w:color w:val="000000"/>
+          <w:sz w:val="20"/>
+          <w:szCs w:val="20"/>
+          <w:lang w:eastAsia="en-US"/>
+        </w:rPr>
+        <w:t>);</w:t>
       </w:r>
     </w:p>
     <w:p>
@@ -2924,7 +3634,33 @@
           <w:szCs w:val="20"/>
           <w:lang w:eastAsia="en-US"/>
         </w:rPr>
-        <w:t xml:space="preserve"> _client.ExecuteAsync(request);</w:t>
+        <w:t xml:space="preserve"> _</w:t>
+      </w:r>
+      <w:proofErr w:type="spellStart"/>
+      <w:r>
+        <w:rPr>
+          <w:rFonts w:ascii="Consolas" w:hAnsi="Consolas" w:cs="Consolas"/>
+          <w:b/>
+          <w:bCs/>
+          <w:color w:val="000000"/>
+          <w:sz w:val="20"/>
+          <w:szCs w:val="20"/>
+          <w:lang w:eastAsia="en-US"/>
+        </w:rPr>
+        <w:t>client.ExecuteAsync</w:t>
+      </w:r>
+      <w:proofErr w:type="spellEnd"/>
+      <w:r>
+        <w:rPr>
+          <w:rFonts w:ascii="Consolas" w:hAnsi="Consolas" w:cs="Consolas"/>
+          <w:b/>
+          <w:bCs/>
+          <w:color w:val="000000"/>
+          <w:sz w:val="20"/>
+          <w:szCs w:val="20"/>
+          <w:lang w:eastAsia="en-US"/>
+        </w:rPr>
+        <w:t>(request);</w:t>
       </w:r>
     </w:p>
     <w:p>
@@ -2979,7 +3715,59 @@
           <w:szCs w:val="20"/>
           <w:lang w:eastAsia="en-US"/>
         </w:rPr>
-        <w:t>(response.StatusCode != HttpStatusCode.OK)</w:t>
+        <w:t>(</w:t>
+      </w:r>
+      <w:proofErr w:type="spellStart"/>
+      <w:r>
+        <w:rPr>
+          <w:rFonts w:ascii="Consolas" w:hAnsi="Consolas" w:cs="Consolas"/>
+          <w:b/>
+          <w:bCs/>
+          <w:color w:val="000000"/>
+          <w:sz w:val="20"/>
+          <w:szCs w:val="20"/>
+          <w:lang w:eastAsia="en-US"/>
+        </w:rPr>
+        <w:t>response.StatusCode</w:t>
+      </w:r>
+      <w:proofErr w:type="spellEnd"/>
+      <w:r>
+        <w:rPr>
+          <w:rFonts w:ascii="Consolas" w:hAnsi="Consolas" w:cs="Consolas"/>
+          <w:b/>
+          <w:bCs/>
+          <w:color w:val="000000"/>
+          <w:sz w:val="20"/>
+          <w:szCs w:val="20"/>
+          <w:lang w:eastAsia="en-US"/>
+        </w:rPr>
+        <w:t xml:space="preserve"> != </w:t>
+      </w:r>
+      <w:proofErr w:type="spellStart"/>
+      <w:r>
+        <w:rPr>
+          <w:rFonts w:ascii="Consolas" w:hAnsi="Consolas" w:cs="Consolas"/>
+          <w:b/>
+          <w:bCs/>
+          <w:color w:val="000000"/>
+          <w:sz w:val="20"/>
+          <w:szCs w:val="20"/>
+          <w:lang w:eastAsia="en-US"/>
+        </w:rPr>
+        <w:t>HttpStatusCode.OK</w:t>
+      </w:r>
+      <w:proofErr w:type="spellEnd"/>
+      <w:r>
+        <w:rPr>
+          <w:rFonts w:ascii="Consolas" w:hAnsi="Consolas" w:cs="Consolas"/>
+          <w:b/>
+          <w:bCs/>
+          <w:color w:val="000000"/>
+          <w:sz w:val="20"/>
+          <w:szCs w:val="20"/>
+          <w:lang w:eastAsia="en-US"/>
+        </w:rPr>
+        <w:t>)</w:t>
       </w:r>
       <w:r>
         <w:rPr>
@@ -3082,7 +3870,33 @@
           <w:szCs w:val="20"/>
           <w:lang w:eastAsia="en-US"/>
         </w:rPr>
-        <w:t xml:space="preserve"> HttpRequestException();</w:t>
+        <w:t xml:space="preserve"> </w:t>
+      </w:r>
+      <w:proofErr w:type="spellStart"/>
+      <w:r>
+        <w:rPr>
+          <w:rFonts w:ascii="Consolas" w:hAnsi="Consolas" w:cs="Consolas"/>
+          <w:b/>
+          <w:bCs/>
+          <w:color w:val="000000"/>
+          <w:sz w:val="20"/>
+          <w:szCs w:val="20"/>
+          <w:lang w:eastAsia="en-US"/>
+        </w:rPr>
+        <w:t>HttpRequestException</w:t>
+      </w:r>
+      <w:proofErr w:type="spellEnd"/>
+      <w:r>
+        <w:rPr>
+          <w:rFonts w:ascii="Consolas" w:hAnsi="Consolas" w:cs="Consolas"/>
+          <w:b/>
+          <w:bCs/>
+          <w:color w:val="000000"/>
+          <w:sz w:val="20"/>
+          <w:szCs w:val="20"/>
+          <w:lang w:eastAsia="en-US"/>
+        </w:rPr>
+        <w:t>();</w:t>
       </w:r>
     </w:p>
     <w:p>
@@ -3168,7 +3982,33 @@
           <w:szCs w:val="20"/>
           <w:lang w:eastAsia="en-US"/>
         </w:rPr>
-        <w:t xml:space="preserve"> response.Content;</w:t>
+        <w:t xml:space="preserve"> </w:t>
+      </w:r>
+      <w:proofErr w:type="spellStart"/>
+      <w:r>
+        <w:rPr>
+          <w:rFonts w:ascii="Consolas" w:hAnsi="Consolas" w:cs="Consolas"/>
+          <w:b/>
+          <w:bCs/>
+          <w:color w:val="000000"/>
+          <w:sz w:val="20"/>
+          <w:szCs w:val="20"/>
+          <w:lang w:eastAsia="en-US"/>
+        </w:rPr>
+        <w:t>response.Content</w:t>
+      </w:r>
+      <w:proofErr w:type="spellEnd"/>
+      <w:r>
+        <w:rPr>
+          <w:rFonts w:ascii="Consolas" w:hAnsi="Consolas" w:cs="Consolas"/>
+          <w:b/>
+          <w:bCs/>
+          <w:color w:val="000000"/>
+          <w:sz w:val="20"/>
+          <w:szCs w:val="20"/>
+          <w:lang w:eastAsia="en-US"/>
+        </w:rPr>
+        <w:t>;</w:t>
       </w:r>
     </w:p>
     <w:p>
@@ -3317,7 +4157,33 @@
           <w:szCs w:val="20"/>
           <w:lang w:eastAsia="en-US"/>
         </w:rPr>
-        <w:t>&gt; GetCustomerById(</w:t>
+        <w:t xml:space="preserve">&gt; </w:t>
+      </w:r>
+      <w:proofErr w:type="spellStart"/>
+      <w:r>
+        <w:rPr>
+          <w:rFonts w:ascii="Consolas" w:hAnsi="Consolas" w:cs="Consolas"/>
+          <w:b/>
+          <w:bCs/>
+          <w:color w:val="000000"/>
+          <w:sz w:val="20"/>
+          <w:szCs w:val="20"/>
+          <w:lang w:eastAsia="en-US"/>
+        </w:rPr>
+        <w:t>GetCustomerById</w:t>
+      </w:r>
+      <w:proofErr w:type="spellEnd"/>
+      <w:r>
+        <w:rPr>
+          <w:rFonts w:ascii="Consolas" w:hAnsi="Consolas" w:cs="Consolas"/>
+          <w:b/>
+          <w:bCs/>
+          <w:color w:val="000000"/>
+          <w:sz w:val="20"/>
+          <w:szCs w:val="20"/>
+          <w:lang w:eastAsia="en-US"/>
+        </w:rPr>
+        <w:t>(</w:t>
       </w:r>
       <w:r>
         <w:rPr>
@@ -3447,7 +4313,33 @@
           <w:szCs w:val="20"/>
           <w:lang w:eastAsia="en-US"/>
         </w:rPr>
-        <w:t xml:space="preserve"> RestRequest(</w:t>
+        <w:t xml:space="preserve"> </w:t>
+      </w:r>
+      <w:proofErr w:type="spellStart"/>
+      <w:r>
+        <w:rPr>
+          <w:rFonts w:ascii="Consolas" w:hAnsi="Consolas" w:cs="Consolas"/>
+          <w:b/>
+          <w:bCs/>
+          <w:color w:val="000000"/>
+          <w:sz w:val="20"/>
+          <w:szCs w:val="20"/>
+          <w:lang w:eastAsia="en-US"/>
+        </w:rPr>
+        <w:t>RestRequest</w:t>
+      </w:r>
+      <w:proofErr w:type="spellEnd"/>
+      <w:r>
+        <w:rPr>
+          <w:rFonts w:ascii="Consolas" w:hAnsi="Consolas" w:cs="Consolas"/>
+          <w:b/>
+          <w:bCs/>
+          <w:color w:val="000000"/>
+          <w:sz w:val="20"/>
+          <w:szCs w:val="20"/>
+          <w:lang w:eastAsia="en-US"/>
+        </w:rPr>
+        <w:t>(</w:t>
       </w:r>
       <w:r>
         <w:rPr>
@@ -3471,7 +4363,33 @@
           <w:szCs w:val="20"/>
           <w:lang w:eastAsia="en-US"/>
         </w:rPr>
-        <w:t xml:space="preserve"> + id, Method.Get);</w:t>
+        <w:t xml:space="preserve"> + id, </w:t>
+      </w:r>
+      <w:proofErr w:type="spellStart"/>
+      <w:r>
+        <w:rPr>
+          <w:rFonts w:ascii="Consolas" w:hAnsi="Consolas" w:cs="Consolas"/>
+          <w:b/>
+          <w:bCs/>
+          <w:color w:val="000000"/>
+          <w:sz w:val="20"/>
+          <w:szCs w:val="20"/>
+          <w:lang w:eastAsia="en-US"/>
+        </w:rPr>
+        <w:t>Method.Get</w:t>
+      </w:r>
+      <w:proofErr w:type="spellEnd"/>
+      <w:r>
+        <w:rPr>
+          <w:rFonts w:ascii="Consolas" w:hAnsi="Consolas" w:cs="Consolas"/>
+          <w:b/>
+          <w:bCs/>
+          <w:color w:val="000000"/>
+          <w:sz w:val="20"/>
+          <w:szCs w:val="20"/>
+          <w:lang w:eastAsia="en-US"/>
+        </w:rPr>
+        <w:t>);</w:t>
       </w:r>
     </w:p>
     <w:p>
@@ -3548,7 +4466,33 @@
           <w:szCs w:val="20"/>
           <w:lang w:eastAsia="en-US"/>
         </w:rPr>
-        <w:t xml:space="preserve"> _client.ExecuteAsync(request);</w:t>
+        <w:t xml:space="preserve"> _</w:t>
+      </w:r>
+      <w:proofErr w:type="spellStart"/>
+      <w:r>
+        <w:rPr>
+          <w:rFonts w:ascii="Consolas" w:hAnsi="Consolas" w:cs="Consolas"/>
+          <w:b/>
+          <w:bCs/>
+          <w:color w:val="000000"/>
+          <w:sz w:val="20"/>
+          <w:szCs w:val="20"/>
+          <w:lang w:eastAsia="en-US"/>
+        </w:rPr>
+        <w:t>client.ExecuteAsync</w:t>
+      </w:r>
+      <w:proofErr w:type="spellEnd"/>
+      <w:r>
+        <w:rPr>
+          <w:rFonts w:ascii="Consolas" w:hAnsi="Consolas" w:cs="Consolas"/>
+          <w:b/>
+          <w:bCs/>
+          <w:color w:val="000000"/>
+          <w:sz w:val="20"/>
+          <w:szCs w:val="20"/>
+          <w:lang w:eastAsia="en-US"/>
+        </w:rPr>
+        <w:t>(request);</w:t>
       </w:r>
     </w:p>
     <w:p>
@@ -3618,7 +4562,59 @@
           <w:szCs w:val="20"/>
           <w:lang w:eastAsia="en-US"/>
         </w:rPr>
-        <w:t xml:space="preserve"> (response.StatusCode != HttpStatusCode.OK)</w:t>
+        <w:t xml:space="preserve"> (</w:t>
+      </w:r>
+      <w:proofErr w:type="spellStart"/>
+      <w:r>
+        <w:rPr>
+          <w:rFonts w:ascii="Consolas" w:hAnsi="Consolas" w:cs="Consolas"/>
+          <w:b/>
+          <w:bCs/>
+          <w:color w:val="000000"/>
+          <w:sz w:val="20"/>
+          <w:szCs w:val="20"/>
+          <w:lang w:eastAsia="en-US"/>
+        </w:rPr>
+        <w:t>response.StatusCode</w:t>
+      </w:r>
+      <w:proofErr w:type="spellEnd"/>
+      <w:r>
+        <w:rPr>
+          <w:rFonts w:ascii="Consolas" w:hAnsi="Consolas" w:cs="Consolas"/>
+          <w:b/>
+          <w:bCs/>
+          <w:color w:val="000000"/>
+          <w:sz w:val="20"/>
+          <w:szCs w:val="20"/>
+          <w:lang w:eastAsia="en-US"/>
+        </w:rPr>
+        <w:t xml:space="preserve"> != </w:t>
+      </w:r>
+      <w:proofErr w:type="spellStart"/>
+      <w:r>
+        <w:rPr>
+          <w:rFonts w:ascii="Consolas" w:hAnsi="Consolas" w:cs="Consolas"/>
+          <w:b/>
+          <w:bCs/>
+          <w:color w:val="000000"/>
+          <w:sz w:val="20"/>
+          <w:szCs w:val="20"/>
+          <w:lang w:eastAsia="en-US"/>
+        </w:rPr>
+        <w:t>HttpStatusCode.OK</w:t>
+      </w:r>
+      <w:proofErr w:type="spellEnd"/>
+      <w:r>
+        <w:rPr>
+          <w:rFonts w:ascii="Consolas" w:hAnsi="Consolas" w:cs="Consolas"/>
+          <w:b/>
+          <w:bCs/>
+          <w:color w:val="000000"/>
+          <w:sz w:val="20"/>
+          <w:szCs w:val="20"/>
+          <w:lang w:eastAsia="en-US"/>
+        </w:rPr>
+        <w:t>)</w:t>
       </w:r>
     </w:p>
     <w:p>
@@ -3724,7 +4720,33 @@
           <w:szCs w:val="20"/>
           <w:lang w:eastAsia="en-US"/>
         </w:rPr>
-        <w:t xml:space="preserve"> HttpRequestException();</w:t>
+        <w:t xml:space="preserve"> </w:t>
+      </w:r>
+      <w:proofErr w:type="spellStart"/>
+      <w:r>
+        <w:rPr>
+          <w:rFonts w:ascii="Consolas" w:hAnsi="Consolas" w:cs="Consolas"/>
+          <w:b/>
+          <w:bCs/>
+          <w:color w:val="000000"/>
+          <w:sz w:val="20"/>
+          <w:szCs w:val="20"/>
+          <w:lang w:eastAsia="en-US"/>
+        </w:rPr>
+        <w:t>HttpRequestException</w:t>
+      </w:r>
+      <w:proofErr w:type="spellEnd"/>
+      <w:r>
+        <w:rPr>
+          <w:rFonts w:ascii="Consolas" w:hAnsi="Consolas" w:cs="Consolas"/>
+          <w:b/>
+          <w:bCs/>
+          <w:color w:val="000000"/>
+          <w:sz w:val="20"/>
+          <w:szCs w:val="20"/>
+          <w:lang w:eastAsia="en-US"/>
+        </w:rPr>
+        <w:t>();</w:t>
       </w:r>
     </w:p>
     <w:p>
@@ -3806,7 +4828,33 @@
           <w:szCs w:val="20"/>
           <w:lang w:eastAsia="en-US"/>
         </w:rPr>
-        <w:t xml:space="preserve"> response.Content;</w:t>
+        <w:t xml:space="preserve"> </w:t>
+      </w:r>
+      <w:proofErr w:type="spellStart"/>
+      <w:r>
+        <w:rPr>
+          <w:rFonts w:ascii="Consolas" w:hAnsi="Consolas" w:cs="Consolas"/>
+          <w:b/>
+          <w:bCs/>
+          <w:color w:val="000000"/>
+          <w:sz w:val="20"/>
+          <w:szCs w:val="20"/>
+          <w:lang w:eastAsia="en-US"/>
+        </w:rPr>
+        <w:t>response.Content</w:t>
+      </w:r>
+      <w:proofErr w:type="spellEnd"/>
+      <w:r>
+        <w:rPr>
+          <w:rFonts w:ascii="Consolas" w:hAnsi="Consolas" w:cs="Consolas"/>
+          <w:b/>
+          <w:bCs/>
+          <w:color w:val="000000"/>
+          <w:sz w:val="20"/>
+          <w:szCs w:val="20"/>
+          <w:lang w:eastAsia="en-US"/>
+        </w:rPr>
+        <w:t>;</w:t>
       </w:r>
     </w:p>
     <w:p>
@@ -3930,12 +4978,56 @@
           <w:sz w:val="24"/>
           <w:szCs w:val="24"/>
         </w:rPr>
-        <w:t>The type XmlElement is defined in an assembly that is not referenced.</w:t>
-      </w:r>
-    </w:p>
-    <w:p>
-      <w:r>
-        <w:t>Click on the line and press Ctrl-. (control dot) to add the required System.Xml and System.Xml.Linq to your assembly (.Net Core has these built in).</w:t>
+        <w:t xml:space="preserve">The type </w:t>
+      </w:r>
+      <w:proofErr w:type="spellStart"/>
+      <w:r>
+        <w:rPr>
+          <w:rFonts w:cs="Times New Roman"/>
+          <w:b/>
+          <w:bCs/>
+          <w:i/>
+          <w:iCs/>
+          <w:color w:val="80340D" w:themeColor="accent2" w:themeShade="80"/>
+          <w:sz w:val="24"/>
+          <w:szCs w:val="24"/>
+        </w:rPr>
+        <w:t>XmlElement</w:t>
+      </w:r>
+      <w:proofErr w:type="spellEnd"/>
+      <w:r>
+        <w:rPr>
+          <w:rFonts w:cs="Times New Roman"/>
+          <w:b/>
+          <w:bCs/>
+          <w:i/>
+          <w:iCs/>
+          <w:color w:val="80340D" w:themeColor="accent2" w:themeShade="80"/>
+          <w:sz w:val="24"/>
+          <w:szCs w:val="24"/>
+        </w:rPr>
+        <w:t xml:space="preserve"> is defined in an assembly that is not referenced.</w:t>
+      </w:r>
+    </w:p>
+    <w:p>
+      <w:r>
+        <w:t xml:space="preserve">Click on the line and press Ctrl-. (control dot) to add the required </w:t>
+      </w:r>
+      <w:proofErr w:type="spellStart"/>
+      <w:r>
+        <w:t>System.Xml</w:t>
+      </w:r>
+      <w:proofErr w:type="spellEnd"/>
+      <w:r>
+        <w:t xml:space="preserve"> and </w:t>
+      </w:r>
+      <w:proofErr w:type="spellStart"/>
+      <w:r>
+        <w:t>System.Xml.Linq</w:t>
+      </w:r>
+      <w:proofErr w:type="spellEnd"/>
+      <w:r>
+        <w:t xml:space="preserve"> to your assembly (.Net Core has these built in).</w:t>
       </w:r>
     </w:p>
     <w:p>
@@ -4012,6 +5104,7 @@
         </w:rPr>
         <w:t xml:space="preserve">Create a unit test class called </w:t>
       </w:r>
+      <w:proofErr w:type="spellStart"/>
       <w:r>
         <w:rPr>
           <w:rFonts w:ascii="Consolas" w:hAnsi="Consolas" w:cs="Consolas"/>
@@ -4024,6 +5117,7 @@
         </w:rPr>
         <w:t>CustomerApiIntegrationTest</w:t>
       </w:r>
+      <w:proofErr w:type="spellEnd"/>
       <w:r>
         <w:rPr>
           <w:sz w:val="24"/>
@@ -4055,6 +5149,7 @@
         </w:rPr>
         <w:t xml:space="preserve">test your </w:t>
       </w:r>
+      <w:proofErr w:type="spellStart"/>
       <w:r>
         <w:rPr>
           <w:rFonts w:ascii="Times New Roman" w:hAnsi="Times New Roman"/>
@@ -4065,6 +5160,7 @@
         </w:rPr>
         <w:t>UserService</w:t>
       </w:r>
+      <w:proofErr w:type="spellEnd"/>
       <w:r>
         <w:rPr>
           <w:rFonts w:ascii="Times New Roman" w:hAnsi="Times New Roman"/>
@@ -4088,6 +5184,7 @@
       <w:r>
         <w:t xml:space="preserve">Create a test class called </w:t>
       </w:r>
+      <w:proofErr w:type="spellStart"/>
       <w:r>
         <w:rPr>
           <w:rFonts w:ascii="Consolas" w:hAnsi="Consolas" w:cs="Consolas"/>
@@ -4100,6 +5197,7 @@
         </w:rPr>
         <w:t>CustomerApiIntegrationTest</w:t>
       </w:r>
+      <w:proofErr w:type="spellEnd"/>
       <w:r>
         <w:rPr>
           <w:sz w:val="24"/>
@@ -4157,7 +5255,33 @@
           <w:szCs w:val="20"/>
           <w:lang w:eastAsia="en-US"/>
         </w:rPr>
-        <w:t xml:space="preserve"> Microsoft.VisualStudio.TestTools.UnitTesting;</w:t>
+        <w:t xml:space="preserve"> </w:t>
+      </w:r>
+      <w:proofErr w:type="spellStart"/>
+      <w:r>
+        <w:rPr>
+          <w:rFonts w:ascii="Consolas" w:hAnsi="Consolas" w:cs="Consolas"/>
+          <w:b/>
+          <w:bCs/>
+          <w:color w:val="000000"/>
+          <w:sz w:val="20"/>
+          <w:szCs w:val="20"/>
+          <w:lang w:eastAsia="en-US"/>
+        </w:rPr>
+        <w:t>Microsoft.VisualStudio.TestTools.UnitTesting</w:t>
+      </w:r>
+      <w:proofErr w:type="spellEnd"/>
+      <w:r>
+        <w:rPr>
+          <w:rFonts w:ascii="Consolas" w:hAnsi="Consolas" w:cs="Consolas"/>
+          <w:b/>
+          <w:bCs/>
+          <w:color w:val="000000"/>
+          <w:sz w:val="20"/>
+          <w:szCs w:val="20"/>
+          <w:lang w:eastAsia="en-US"/>
+        </w:rPr>
+        <w:t>;</w:t>
       </w:r>
     </w:p>
     <w:p>
@@ -4200,7 +5324,33 @@
           <w:szCs w:val="20"/>
           <w:lang w:eastAsia="en-US"/>
         </w:rPr>
-        <w:t xml:space="preserve"> System.Threading.Tasks;</w:t>
+        <w:t xml:space="preserve"> </w:t>
+      </w:r>
+      <w:proofErr w:type="spellStart"/>
+      <w:r>
+        <w:rPr>
+          <w:rFonts w:ascii="Consolas" w:hAnsi="Consolas" w:cs="Consolas"/>
+          <w:b/>
+          <w:bCs/>
+          <w:color w:val="000000"/>
+          <w:sz w:val="20"/>
+          <w:szCs w:val="20"/>
+          <w:lang w:eastAsia="en-US"/>
+        </w:rPr>
+        <w:t>System.Threading.Tasks</w:t>
+      </w:r>
+      <w:proofErr w:type="spellEnd"/>
+      <w:r>
+        <w:rPr>
+          <w:rFonts w:ascii="Consolas" w:hAnsi="Consolas" w:cs="Consolas"/>
+          <w:b/>
+          <w:bCs/>
+          <w:color w:val="000000"/>
+          <w:sz w:val="20"/>
+          <w:szCs w:val="20"/>
+          <w:lang w:eastAsia="en-US"/>
+        </w:rPr>
+        <w:t>;</w:t>
       </w:r>
     </w:p>
     <w:p>
@@ -4243,7 +5393,33 @@
           <w:szCs w:val="20"/>
           <w:lang w:eastAsia="en-US"/>
         </w:rPr>
-        <w:t xml:space="preserve"> FluentAssertions;</w:t>
+        <w:t xml:space="preserve"> </w:t>
+      </w:r>
+      <w:proofErr w:type="spellStart"/>
+      <w:r>
+        <w:rPr>
+          <w:rFonts w:ascii="Consolas" w:hAnsi="Consolas" w:cs="Consolas"/>
+          <w:b/>
+          <w:bCs/>
+          <w:color w:val="000000"/>
+          <w:sz w:val="20"/>
+          <w:szCs w:val="20"/>
+          <w:lang w:eastAsia="en-US"/>
+        </w:rPr>
+        <w:t>FluentAssertions</w:t>
+      </w:r>
+      <w:proofErr w:type="spellEnd"/>
+      <w:r>
+        <w:rPr>
+          <w:rFonts w:ascii="Consolas" w:hAnsi="Consolas" w:cs="Consolas"/>
+          <w:b/>
+          <w:bCs/>
+          <w:color w:val="000000"/>
+          <w:sz w:val="20"/>
+          <w:szCs w:val="20"/>
+          <w:lang w:eastAsia="en-US"/>
+        </w:rPr>
+        <w:t>;</w:t>
       </w:r>
     </w:p>
     <w:p>
@@ -4286,7 +5462,33 @@
           <w:szCs w:val="20"/>
           <w:lang w:eastAsia="en-US"/>
         </w:rPr>
-        <w:t xml:space="preserve"> RestSharp;</w:t>
+        <w:t xml:space="preserve"> </w:t>
+      </w:r>
+      <w:proofErr w:type="spellStart"/>
+      <w:r>
+        <w:rPr>
+          <w:rFonts w:ascii="Consolas" w:hAnsi="Consolas" w:cs="Consolas"/>
+          <w:b/>
+          <w:bCs/>
+          <w:color w:val="000000"/>
+          <w:sz w:val="20"/>
+          <w:szCs w:val="20"/>
+          <w:lang w:eastAsia="en-US"/>
+        </w:rPr>
+        <w:t>RestSharp</w:t>
+      </w:r>
+      <w:proofErr w:type="spellEnd"/>
+      <w:r>
+        <w:rPr>
+          <w:rFonts w:ascii="Consolas" w:hAnsi="Consolas" w:cs="Consolas"/>
+          <w:b/>
+          <w:bCs/>
+          <w:color w:val="000000"/>
+          <w:sz w:val="20"/>
+          <w:szCs w:val="20"/>
+          <w:lang w:eastAsia="en-US"/>
+        </w:rPr>
+        <w:t>;</w:t>
       </w:r>
     </w:p>
     <w:p>
@@ -4336,7 +5538,33 @@
           <w:szCs w:val="20"/>
           <w:lang w:eastAsia="en-US"/>
         </w:rPr>
-        <w:t>[TestClass]</w:t>
+        <w:t>[</w:t>
+      </w:r>
+      <w:proofErr w:type="spellStart"/>
+      <w:r>
+        <w:rPr>
+          <w:rFonts w:ascii="Consolas" w:hAnsi="Consolas" w:cs="Consolas"/>
+          <w:b/>
+          <w:bCs/>
+          <w:color w:val="000000"/>
+          <w:sz w:val="20"/>
+          <w:szCs w:val="20"/>
+          <w:lang w:eastAsia="en-US"/>
+        </w:rPr>
+        <w:t>TestClass</w:t>
+      </w:r>
+      <w:proofErr w:type="spellEnd"/>
+      <w:r>
+        <w:rPr>
+          <w:rFonts w:ascii="Consolas" w:hAnsi="Consolas" w:cs="Consolas"/>
+          <w:b/>
+          <w:bCs/>
+          <w:color w:val="000000"/>
+          <w:sz w:val="20"/>
+          <w:szCs w:val="20"/>
+          <w:lang w:eastAsia="en-US"/>
+        </w:rPr>
+        <w:t>]</w:t>
       </w:r>
     </w:p>
     <w:p>
@@ -4405,6 +5633,7 @@
         </w:rPr>
         <w:t xml:space="preserve"> </w:t>
       </w:r>
+      <w:proofErr w:type="spellStart"/>
       <w:r>
         <w:rPr>
           <w:rFonts w:ascii="Consolas" w:hAnsi="Consolas" w:cs="Consolas"/>
@@ -4417,6 +5646,7 @@
         </w:rPr>
         <w:t>CustomerApiIntegrationTest</w:t>
       </w:r>
+      <w:proofErr w:type="spellEnd"/>
     </w:p>
     <w:p>
       <w:pPr>
@@ -4525,7 +5755,33 @@
           <w:szCs w:val="20"/>
           <w:lang w:eastAsia="en-US"/>
         </w:rPr>
-        <w:t xml:space="preserve"> RestClient _client;</w:t>
+        <w:t xml:space="preserve"> </w:t>
+      </w:r>
+      <w:proofErr w:type="spellStart"/>
+      <w:r>
+        <w:rPr>
+          <w:rFonts w:ascii="Consolas" w:hAnsi="Consolas" w:cs="Consolas"/>
+          <w:b/>
+          <w:bCs/>
+          <w:color w:val="000000"/>
+          <w:sz w:val="20"/>
+          <w:szCs w:val="20"/>
+          <w:lang w:eastAsia="en-US"/>
+        </w:rPr>
+        <w:t>RestClient</w:t>
+      </w:r>
+      <w:proofErr w:type="spellEnd"/>
+      <w:r>
+        <w:rPr>
+          <w:rFonts w:ascii="Consolas" w:hAnsi="Consolas" w:cs="Consolas"/>
+          <w:b/>
+          <w:bCs/>
+          <w:color w:val="000000"/>
+          <w:sz w:val="20"/>
+          <w:szCs w:val="20"/>
+          <w:lang w:eastAsia="en-US"/>
+        </w:rPr>
+        <w:t xml:space="preserve"> _client;</w:t>
       </w:r>
     </w:p>
     <w:p>
@@ -4575,7 +5831,33 @@
           <w:szCs w:val="20"/>
           <w:lang w:eastAsia="en-US"/>
         </w:rPr>
-        <w:t xml:space="preserve">    [ClassInitialize]</w:t>
+        <w:t xml:space="preserve">    [</w:t>
+      </w:r>
+      <w:proofErr w:type="spellStart"/>
+      <w:r>
+        <w:rPr>
+          <w:rFonts w:ascii="Consolas" w:hAnsi="Consolas" w:cs="Consolas"/>
+          <w:b/>
+          <w:bCs/>
+          <w:color w:val="000000"/>
+          <w:sz w:val="20"/>
+          <w:szCs w:val="20"/>
+          <w:lang w:eastAsia="en-US"/>
+        </w:rPr>
+        <w:t>ClassInitialize</w:t>
+      </w:r>
+      <w:proofErr w:type="spellEnd"/>
+      <w:r>
+        <w:rPr>
+          <w:rFonts w:ascii="Consolas" w:hAnsi="Consolas" w:cs="Consolas"/>
+          <w:b/>
+          <w:bCs/>
+          <w:color w:val="000000"/>
+          <w:sz w:val="20"/>
+          <w:szCs w:val="20"/>
+          <w:lang w:eastAsia="en-US"/>
+        </w:rPr>
+        <w:t>]</w:t>
       </w:r>
     </w:p>
     <w:p>
@@ -4678,7 +5960,33 @@
           <w:szCs w:val="20"/>
           <w:lang w:eastAsia="en-US"/>
         </w:rPr>
-        <w:t xml:space="preserve"> Setup(TestContext context)</w:t>
+        <w:t xml:space="preserve"> Setup(</w:t>
+      </w:r>
+      <w:proofErr w:type="spellStart"/>
+      <w:r>
+        <w:rPr>
+          <w:rFonts w:ascii="Consolas" w:hAnsi="Consolas" w:cs="Consolas"/>
+          <w:b/>
+          <w:bCs/>
+          <w:color w:val="000000"/>
+          <w:sz w:val="20"/>
+          <w:szCs w:val="20"/>
+          <w:lang w:eastAsia="en-US"/>
+        </w:rPr>
+        <w:t>TestContext</w:t>
+      </w:r>
+      <w:proofErr w:type="spellEnd"/>
+      <w:r>
+        <w:rPr>
+          <w:rFonts w:ascii="Consolas" w:hAnsi="Consolas" w:cs="Consolas"/>
+          <w:b/>
+          <w:bCs/>
+          <w:color w:val="000000"/>
+          <w:sz w:val="20"/>
+          <w:szCs w:val="20"/>
+          <w:lang w:eastAsia="en-US"/>
+        </w:rPr>
+        <w:t xml:space="preserve"> context)</w:t>
       </w:r>
     </w:p>
     <w:p>
@@ -4760,7 +6068,33 @@
           <w:szCs w:val="20"/>
           <w:lang w:eastAsia="en-US"/>
         </w:rPr>
-        <w:t xml:space="preserve"> RestClient(</w:t>
+        <w:t xml:space="preserve"> </w:t>
+      </w:r>
+      <w:proofErr w:type="spellStart"/>
+      <w:r>
+        <w:rPr>
+          <w:rFonts w:ascii="Consolas" w:hAnsi="Consolas" w:cs="Consolas"/>
+          <w:b/>
+          <w:bCs/>
+          <w:color w:val="000000"/>
+          <w:sz w:val="20"/>
+          <w:szCs w:val="20"/>
+          <w:lang w:eastAsia="en-US"/>
+        </w:rPr>
+        <w:t>RestClient</w:t>
+      </w:r>
+      <w:proofErr w:type="spellEnd"/>
+      <w:r>
+        <w:rPr>
+          <w:rFonts w:ascii="Consolas" w:hAnsi="Consolas" w:cs="Consolas"/>
+          <w:b/>
+          <w:bCs/>
+          <w:color w:val="000000"/>
+          <w:sz w:val="20"/>
+          <w:szCs w:val="20"/>
+          <w:lang w:eastAsia="en-US"/>
+        </w:rPr>
+        <w:t>(</w:t>
       </w:r>
       <w:r>
         <w:rPr>
@@ -4784,7 +6118,7 @@
           <w:szCs w:val="20"/>
           <w:lang w:eastAsia="en-US"/>
         </w:rPr>
-        <w:t>https://mike-jov1.onrender.com</w:t>
+        <w:t>https://</w:t>
       </w:r>
       <w:r>
         <w:rPr>
@@ -4796,6 +6130,30 @@
           <w:szCs w:val="20"/>
           <w:lang w:eastAsia="en-US"/>
         </w:rPr>
+        <w:t>tx100</w:t>
+      </w:r>
+      <w:r>
+        <w:rPr>
+          <w:rFonts w:ascii="Consolas" w:hAnsi="Consolas" w:cs="Consolas"/>
+          <w:b/>
+          <w:bCs/>
+          <w:color w:val="A31515"/>
+          <w:sz w:val="20"/>
+          <w:szCs w:val="20"/>
+          <w:lang w:eastAsia="en-US"/>
+        </w:rPr>
+        <w:t>.onrender.com</w:t>
+      </w:r>
+      <w:r>
+        <w:rPr>
+          <w:rFonts w:ascii="Consolas" w:hAnsi="Consolas" w:cs="Consolas"/>
+          <w:b/>
+          <w:bCs/>
+          <w:color w:val="A31515"/>
+          <w:sz w:val="20"/>
+          <w:szCs w:val="20"/>
+          <w:lang w:eastAsia="en-US"/>
+        </w:rPr>
         <w:t>"</w:t>
       </w:r>
       <w:r>
@@ -4895,7 +6253,33 @@
           <w:szCs w:val="20"/>
           <w:lang w:eastAsia="en-US"/>
         </w:rPr>
-        <w:t xml:space="preserve">    [TestMethod]</w:t>
+        <w:t xml:space="preserve">    [</w:t>
+      </w:r>
+      <w:proofErr w:type="spellStart"/>
+      <w:r>
+        <w:rPr>
+          <w:rFonts w:ascii="Consolas" w:hAnsi="Consolas" w:cs="Consolas"/>
+          <w:b/>
+          <w:bCs/>
+          <w:color w:val="000000"/>
+          <w:sz w:val="20"/>
+          <w:szCs w:val="20"/>
+          <w:lang w:eastAsia="en-US"/>
+        </w:rPr>
+        <w:t>TestMethod</w:t>
+      </w:r>
+      <w:proofErr w:type="spellEnd"/>
+      <w:r>
+        <w:rPr>
+          <w:rFonts w:ascii="Consolas" w:hAnsi="Consolas" w:cs="Consolas"/>
+          <w:b/>
+          <w:bCs/>
+          <w:color w:val="000000"/>
+          <w:sz w:val="20"/>
+          <w:szCs w:val="20"/>
+          <w:lang w:eastAsia="en-US"/>
+        </w:rPr>
+        <w:t>]</w:t>
       </w:r>
     </w:p>
     <w:p>
@@ -4972,7 +6356,33 @@
           <w:szCs w:val="20"/>
           <w:lang w:eastAsia="en-US"/>
         </w:rPr>
-        <w:t xml:space="preserve"> Task TestFetchCustomers()</w:t>
+        <w:t xml:space="preserve"> Task </w:t>
+      </w:r>
+      <w:proofErr w:type="spellStart"/>
+      <w:r>
+        <w:rPr>
+          <w:rFonts w:ascii="Consolas" w:hAnsi="Consolas" w:cs="Consolas"/>
+          <w:b/>
+          <w:bCs/>
+          <w:color w:val="000000"/>
+          <w:sz w:val="20"/>
+          <w:szCs w:val="20"/>
+          <w:lang w:eastAsia="en-US"/>
+        </w:rPr>
+        <w:t>TestFetchCustomers</w:t>
+      </w:r>
+      <w:proofErr w:type="spellEnd"/>
+      <w:r>
+        <w:rPr>
+          <w:rFonts w:ascii="Consolas" w:hAnsi="Consolas" w:cs="Consolas"/>
+          <w:b/>
+          <w:bCs/>
+          <w:color w:val="000000"/>
+          <w:sz w:val="20"/>
+          <w:szCs w:val="20"/>
+          <w:lang w:eastAsia="en-US"/>
+        </w:rPr>
+        <w:t>()</w:t>
       </w:r>
     </w:p>
     <w:p>
@@ -5054,7 +6464,33 @@
           <w:szCs w:val="20"/>
           <w:lang w:eastAsia="en-US"/>
         </w:rPr>
-        <w:t xml:space="preserve"> userService = </w:t>
+        <w:t xml:space="preserve"> </w:t>
+      </w:r>
+      <w:proofErr w:type="spellStart"/>
+      <w:r>
+        <w:rPr>
+          <w:rFonts w:ascii="Consolas" w:hAnsi="Consolas" w:cs="Consolas"/>
+          <w:b/>
+          <w:bCs/>
+          <w:color w:val="000000"/>
+          <w:sz w:val="20"/>
+          <w:szCs w:val="20"/>
+          <w:lang w:eastAsia="en-US"/>
+        </w:rPr>
+        <w:t>userService</w:t>
+      </w:r>
+      <w:proofErr w:type="spellEnd"/>
+      <w:r>
+        <w:rPr>
+          <w:rFonts w:ascii="Consolas" w:hAnsi="Consolas" w:cs="Consolas"/>
+          <w:b/>
+          <w:bCs/>
+          <w:color w:val="000000"/>
+          <w:sz w:val="20"/>
+          <w:szCs w:val="20"/>
+          <w:lang w:eastAsia="en-US"/>
+        </w:rPr>
+        <w:t xml:space="preserve"> = </w:t>
       </w:r>
       <w:r>
         <w:rPr>
@@ -5078,7 +6514,33 @@
           <w:szCs w:val="20"/>
           <w:lang w:eastAsia="en-US"/>
         </w:rPr>
-        <w:t xml:space="preserve"> UserService();</w:t>
+        <w:t xml:space="preserve"> </w:t>
+      </w:r>
+      <w:proofErr w:type="spellStart"/>
+      <w:r>
+        <w:rPr>
+          <w:rFonts w:ascii="Consolas" w:hAnsi="Consolas" w:cs="Consolas"/>
+          <w:b/>
+          <w:bCs/>
+          <w:color w:val="000000"/>
+          <w:sz w:val="20"/>
+          <w:szCs w:val="20"/>
+          <w:lang w:eastAsia="en-US"/>
+        </w:rPr>
+        <w:t>UserService</w:t>
+      </w:r>
+      <w:proofErr w:type="spellEnd"/>
+      <w:r>
+        <w:rPr>
+          <w:rFonts w:ascii="Consolas" w:hAnsi="Consolas" w:cs="Consolas"/>
+          <w:b/>
+          <w:bCs/>
+          <w:color w:val="000000"/>
+          <w:sz w:val="20"/>
+          <w:szCs w:val="20"/>
+          <w:lang w:eastAsia="en-US"/>
+        </w:rPr>
+        <w:t>();</w:t>
       </w:r>
     </w:p>
     <w:p>
@@ -5156,36 +6618,88 @@
           <w:szCs w:val="20"/>
           <w:lang w:eastAsia="en-US"/>
         </w:rPr>
-        <w:t xml:space="preserve"> userService.GetCustomers();</w:t>
-      </w:r>
-    </w:p>
-    <w:p>
-      <w:pPr>
-        <w:suppressAutoHyphens w:val="0"/>
-        <w:autoSpaceDE w:val="0"/>
-        <w:autoSpaceDN w:val="0"/>
-        <w:adjustRightInd w:val="0"/>
-        <w:rPr>
-          <w:rFonts w:ascii="Consolas" w:hAnsi="Consolas" w:cs="Consolas"/>
-          <w:b/>
-          <w:bCs/>
-          <w:color w:val="000000"/>
-          <w:sz w:val="20"/>
-          <w:szCs w:val="20"/>
-          <w:lang w:eastAsia="en-US"/>
-        </w:rPr>
-      </w:pPr>
-      <w:r>
-        <w:rPr>
-          <w:rFonts w:ascii="Consolas" w:hAnsi="Consolas" w:cs="Consolas"/>
-          <w:b/>
-          <w:bCs/>
-          <w:color w:val="000000"/>
-          <w:sz w:val="20"/>
-          <w:szCs w:val="20"/>
-          <w:lang w:eastAsia="en-US"/>
-        </w:rPr>
-        <w:t xml:space="preserve">        response.Should().Contain(</w:t>
+        <w:t xml:space="preserve"> </w:t>
+      </w:r>
+      <w:proofErr w:type="spellStart"/>
+      <w:r>
+        <w:rPr>
+          <w:rFonts w:ascii="Consolas" w:hAnsi="Consolas" w:cs="Consolas"/>
+          <w:b/>
+          <w:bCs/>
+          <w:color w:val="000000"/>
+          <w:sz w:val="20"/>
+          <w:szCs w:val="20"/>
+          <w:lang w:eastAsia="en-US"/>
+        </w:rPr>
+        <w:t>userService.GetCustomers</w:t>
+      </w:r>
+      <w:proofErr w:type="spellEnd"/>
+      <w:r>
+        <w:rPr>
+          <w:rFonts w:ascii="Consolas" w:hAnsi="Consolas" w:cs="Consolas"/>
+          <w:b/>
+          <w:bCs/>
+          <w:color w:val="000000"/>
+          <w:sz w:val="20"/>
+          <w:szCs w:val="20"/>
+          <w:lang w:eastAsia="en-US"/>
+        </w:rPr>
+        <w:t>();</w:t>
+      </w:r>
+    </w:p>
+    <w:p>
+      <w:pPr>
+        <w:suppressAutoHyphens w:val="0"/>
+        <w:autoSpaceDE w:val="0"/>
+        <w:autoSpaceDN w:val="0"/>
+        <w:adjustRightInd w:val="0"/>
+        <w:rPr>
+          <w:rFonts w:ascii="Consolas" w:hAnsi="Consolas" w:cs="Consolas"/>
+          <w:b/>
+          <w:bCs/>
+          <w:color w:val="000000"/>
+          <w:sz w:val="20"/>
+          <w:szCs w:val="20"/>
+          <w:lang w:eastAsia="en-US"/>
+        </w:rPr>
+      </w:pPr>
+      <w:r>
+        <w:rPr>
+          <w:rFonts w:ascii="Consolas" w:hAnsi="Consolas" w:cs="Consolas"/>
+          <w:b/>
+          <w:bCs/>
+          <w:color w:val="000000"/>
+          <w:sz w:val="20"/>
+          <w:szCs w:val="20"/>
+          <w:lang w:eastAsia="en-US"/>
+        </w:rPr>
+        <w:t xml:space="preserve">        </w:t>
+      </w:r>
+      <w:proofErr w:type="spellStart"/>
+      <w:r>
+        <w:rPr>
+          <w:rFonts w:ascii="Consolas" w:hAnsi="Consolas" w:cs="Consolas"/>
+          <w:b/>
+          <w:bCs/>
+          <w:color w:val="000000"/>
+          <w:sz w:val="20"/>
+          <w:szCs w:val="20"/>
+          <w:lang w:eastAsia="en-US"/>
+        </w:rPr>
+        <w:t>response.Should</w:t>
+      </w:r>
+      <w:proofErr w:type="spellEnd"/>
+      <w:r>
+        <w:rPr>
+          <w:rFonts w:ascii="Consolas" w:hAnsi="Consolas" w:cs="Consolas"/>
+          <w:b/>
+          <w:bCs/>
+          <w:color w:val="000000"/>
+          <w:sz w:val="20"/>
+          <w:szCs w:val="20"/>
+          <w:lang w:eastAsia="en-US"/>
+        </w:rPr>
+        <w:t>().Contain(</w:t>
       </w:r>
       <w:r>
         <w:rPr>
@@ -5284,7 +6798,33 @@
           <w:szCs w:val="20"/>
           <w:lang w:eastAsia="en-US"/>
         </w:rPr>
-        <w:t xml:space="preserve">    [TestMethod]</w:t>
+        <w:t xml:space="preserve">    [</w:t>
+      </w:r>
+      <w:proofErr w:type="spellStart"/>
+      <w:r>
+        <w:rPr>
+          <w:rFonts w:ascii="Consolas" w:hAnsi="Consolas" w:cs="Consolas"/>
+          <w:b/>
+          <w:bCs/>
+          <w:color w:val="000000"/>
+          <w:sz w:val="20"/>
+          <w:szCs w:val="20"/>
+          <w:lang w:eastAsia="en-US"/>
+        </w:rPr>
+        <w:t>TestMethod</w:t>
+      </w:r>
+      <w:proofErr w:type="spellEnd"/>
+      <w:r>
+        <w:rPr>
+          <w:rFonts w:ascii="Consolas" w:hAnsi="Consolas" w:cs="Consolas"/>
+          <w:b/>
+          <w:bCs/>
+          <w:color w:val="000000"/>
+          <w:sz w:val="20"/>
+          <w:szCs w:val="20"/>
+          <w:lang w:eastAsia="en-US"/>
+        </w:rPr>
+        <w:t>]</w:t>
       </w:r>
     </w:p>
     <w:p>
@@ -5361,7 +6901,33 @@
           <w:szCs w:val="20"/>
           <w:lang w:eastAsia="en-US"/>
         </w:rPr>
-        <w:t xml:space="preserve"> Task TestGetCustomerById()</w:t>
+        <w:t xml:space="preserve"> Task </w:t>
+      </w:r>
+      <w:proofErr w:type="spellStart"/>
+      <w:r>
+        <w:rPr>
+          <w:rFonts w:ascii="Consolas" w:hAnsi="Consolas" w:cs="Consolas"/>
+          <w:b/>
+          <w:bCs/>
+          <w:color w:val="000000"/>
+          <w:sz w:val="20"/>
+          <w:szCs w:val="20"/>
+          <w:lang w:eastAsia="en-US"/>
+        </w:rPr>
+        <w:t>TestGetCustomerById</w:t>
+      </w:r>
+      <w:proofErr w:type="spellEnd"/>
+      <w:r>
+        <w:rPr>
+          <w:rFonts w:ascii="Consolas" w:hAnsi="Consolas" w:cs="Consolas"/>
+          <w:b/>
+          <w:bCs/>
+          <w:color w:val="000000"/>
+          <w:sz w:val="20"/>
+          <w:szCs w:val="20"/>
+          <w:lang w:eastAsia="en-US"/>
+        </w:rPr>
+        <w:t>()</w:t>
       </w:r>
     </w:p>
     <w:p>
@@ -5443,7 +7009,33 @@
           <w:szCs w:val="20"/>
           <w:lang w:eastAsia="en-US"/>
         </w:rPr>
-        <w:t xml:space="preserve"> userService = </w:t>
+        <w:t xml:space="preserve"> </w:t>
+      </w:r>
+      <w:proofErr w:type="spellStart"/>
+      <w:r>
+        <w:rPr>
+          <w:rFonts w:ascii="Consolas" w:hAnsi="Consolas" w:cs="Consolas"/>
+          <w:b/>
+          <w:bCs/>
+          <w:color w:val="000000"/>
+          <w:sz w:val="20"/>
+          <w:szCs w:val="20"/>
+          <w:lang w:eastAsia="en-US"/>
+        </w:rPr>
+        <w:t>userService</w:t>
+      </w:r>
+      <w:proofErr w:type="spellEnd"/>
+      <w:r>
+        <w:rPr>
+          <w:rFonts w:ascii="Consolas" w:hAnsi="Consolas" w:cs="Consolas"/>
+          <w:b/>
+          <w:bCs/>
+          <w:color w:val="000000"/>
+          <w:sz w:val="20"/>
+          <w:szCs w:val="20"/>
+          <w:lang w:eastAsia="en-US"/>
+        </w:rPr>
+        <w:t xml:space="preserve"> = </w:t>
       </w:r>
       <w:r>
         <w:rPr>
@@ -5467,7 +7059,33 @@
           <w:szCs w:val="20"/>
           <w:lang w:eastAsia="en-US"/>
         </w:rPr>
-        <w:t xml:space="preserve"> UserService();</w:t>
+        <w:t xml:space="preserve"> </w:t>
+      </w:r>
+      <w:proofErr w:type="spellStart"/>
+      <w:r>
+        <w:rPr>
+          <w:rFonts w:ascii="Consolas" w:hAnsi="Consolas" w:cs="Consolas"/>
+          <w:b/>
+          <w:bCs/>
+          <w:color w:val="000000"/>
+          <w:sz w:val="20"/>
+          <w:szCs w:val="20"/>
+          <w:lang w:eastAsia="en-US"/>
+        </w:rPr>
+        <w:t>UserService</w:t>
+      </w:r>
+      <w:proofErr w:type="spellEnd"/>
+      <w:r>
+        <w:rPr>
+          <w:rFonts w:ascii="Consolas" w:hAnsi="Consolas" w:cs="Consolas"/>
+          <w:b/>
+          <w:bCs/>
+          <w:color w:val="000000"/>
+          <w:sz w:val="20"/>
+          <w:szCs w:val="20"/>
+          <w:lang w:eastAsia="en-US"/>
+        </w:rPr>
+        <w:t>();</w:t>
       </w:r>
     </w:p>
     <w:p>
@@ -5544,7 +7162,33 @@
           <w:szCs w:val="20"/>
           <w:lang w:eastAsia="en-US"/>
         </w:rPr>
-        <w:t xml:space="preserve"> userService.GetCustomerById(</w:t>
+        <w:t xml:space="preserve"> </w:t>
+      </w:r>
+      <w:proofErr w:type="spellStart"/>
+      <w:r>
+        <w:rPr>
+          <w:rFonts w:ascii="Consolas" w:hAnsi="Consolas" w:cs="Consolas"/>
+          <w:b/>
+          <w:bCs/>
+          <w:color w:val="000000"/>
+          <w:sz w:val="20"/>
+          <w:szCs w:val="20"/>
+          <w:lang w:eastAsia="en-US"/>
+        </w:rPr>
+        <w:t>userService.GetCustomerById</w:t>
+      </w:r>
+      <w:proofErr w:type="spellEnd"/>
+      <w:r>
+        <w:rPr>
+          <w:rFonts w:ascii="Consolas" w:hAnsi="Consolas" w:cs="Consolas"/>
+          <w:b/>
+          <w:bCs/>
+          <w:color w:val="000000"/>
+          <w:sz w:val="20"/>
+          <w:szCs w:val="20"/>
+          <w:lang w:eastAsia="en-US"/>
+        </w:rPr>
+        <w:t>(</w:t>
       </w:r>
       <w:r>
         <w:rPr>
@@ -5597,7 +7241,33 @@
           <w:szCs w:val="20"/>
           <w:lang w:eastAsia="en-US"/>
         </w:rPr>
-        <w:t xml:space="preserve">        response.Should().Contain(</w:t>
+        <w:t xml:space="preserve">        </w:t>
+      </w:r>
+      <w:proofErr w:type="spellStart"/>
+      <w:r>
+        <w:rPr>
+          <w:rFonts w:ascii="Consolas" w:hAnsi="Consolas" w:cs="Consolas"/>
+          <w:b/>
+          <w:bCs/>
+          <w:color w:val="000000"/>
+          <w:sz w:val="20"/>
+          <w:szCs w:val="20"/>
+          <w:lang w:eastAsia="en-US"/>
+        </w:rPr>
+        <w:t>response.Should</w:t>
+      </w:r>
+      <w:proofErr w:type="spellEnd"/>
+      <w:r>
+        <w:rPr>
+          <w:rFonts w:ascii="Consolas" w:hAnsi="Consolas" w:cs="Consolas"/>
+          <w:b/>
+          <w:bCs/>
+          <w:color w:val="000000"/>
+          <w:sz w:val="20"/>
+          <w:szCs w:val="20"/>
+          <w:lang w:eastAsia="en-US"/>
+        </w:rPr>
+        <w:t>().Contain(</w:t>
       </w:r>
       <w:r>
         <w:rPr>
@@ -5716,6 +7386,7 @@
         </w:rPr>
         <w:t xml:space="preserve">Note: You can add code to test for </w:t>
       </w:r>
+      <w:proofErr w:type="spellStart"/>
       <w:r>
         <w:rPr>
           <w:rFonts w:ascii="Consolas" w:hAnsi="Consolas" w:cs="Consolas"/>
@@ -5728,6 +7399,7 @@
         </w:rPr>
         <w:t>HttpRequestException</w:t>
       </w:r>
+      <w:proofErr w:type="spellEnd"/>
       <w:r>
         <w:rPr>
           <w:rFonts w:ascii="Consolas" w:hAnsi="Consolas" w:cs="Consolas"/>
@@ -5752,18 +7424,46 @@
         </w:rPr>
         <w:br/>
       </w:r>
-      <w:r>
-        <w:rPr>
-          <w:rFonts w:ascii="Consolas" w:hAnsi="Consolas" w:cs="Consolas"/>
-          <w:b/>
-          <w:bCs/>
-          <w:color w:val="000000"/>
-          <w:sz w:val="20"/>
-          <w:szCs w:val="20"/>
-          <w:lang w:eastAsia="en-US"/>
-        </w:rPr>
-        <w:t>response.StatusCode != HttpStatusCode.OK</w:t>
-      </w:r>
+      <w:proofErr w:type="spellStart"/>
+      <w:r>
+        <w:rPr>
+          <w:rFonts w:ascii="Consolas" w:hAnsi="Consolas" w:cs="Consolas"/>
+          <w:b/>
+          <w:bCs/>
+          <w:color w:val="000000"/>
+          <w:sz w:val="20"/>
+          <w:szCs w:val="20"/>
+          <w:lang w:eastAsia="en-US"/>
+        </w:rPr>
+        <w:t>response.StatusCode</w:t>
+      </w:r>
+      <w:proofErr w:type="spellEnd"/>
+      <w:r>
+        <w:rPr>
+          <w:rFonts w:ascii="Consolas" w:hAnsi="Consolas" w:cs="Consolas"/>
+          <w:b/>
+          <w:bCs/>
+          <w:color w:val="000000"/>
+          <w:sz w:val="20"/>
+          <w:szCs w:val="20"/>
+          <w:lang w:eastAsia="en-US"/>
+        </w:rPr>
+        <w:t xml:space="preserve"> != </w:t>
+      </w:r>
+      <w:proofErr w:type="spellStart"/>
+      <w:r>
+        <w:rPr>
+          <w:rFonts w:ascii="Consolas" w:hAnsi="Consolas" w:cs="Consolas"/>
+          <w:b/>
+          <w:bCs/>
+          <w:color w:val="000000"/>
+          <w:sz w:val="20"/>
+          <w:szCs w:val="20"/>
+          <w:lang w:eastAsia="en-US"/>
+        </w:rPr>
+        <w:t>HttpStatusCode.OK</w:t>
+      </w:r>
+      <w:proofErr w:type="spellEnd"/>
     </w:p>
     <w:p>
       <w:pPr>
@@ -5831,6 +7531,7 @@
       <w:r>
         <w:t xml:space="preserve"> </w:t>
       </w:r>
+      <w:proofErr w:type="spellStart"/>
       <w:r>
         <w:rPr>
           <w:b/>
@@ -5838,6 +7539,7 @@
         </w:rPr>
         <w:t>CustomerApiIntegrationTest</w:t>
       </w:r>
+      <w:proofErr w:type="spellEnd"/>
       <w:r>
         <w:t xml:space="preserve"> </w:t>
       </w:r>
@@ -5924,8 +7626,16 @@
         <w:rPr>
           <w:lang w:eastAsia="en-US"/>
         </w:rPr>
-        <w:t>Starter code for UserService</w:t>
-      </w:r>
+        <w:t xml:space="preserve">Starter code for </w:t>
+      </w:r>
+      <w:proofErr w:type="spellStart"/>
+      <w:r>
+        <w:rPr>
+          <w:lang w:eastAsia="en-US"/>
+        </w:rPr>
+        <w:t>UserService</w:t>
+      </w:r>
+      <w:proofErr w:type="spellEnd"/>
     </w:p>
     <w:p>
       <w:pPr>
@@ -5991,6 +7701,7 @@
         </w:rPr>
         <w:t xml:space="preserve"> </w:t>
       </w:r>
+      <w:proofErr w:type="spellStart"/>
       <w:r>
         <w:rPr>
           <w:rFonts w:ascii="Consolas" w:hAnsi="Consolas" w:cs="Consolas"/>
@@ -6003,6 +7714,7 @@
         </w:rPr>
         <w:t>UserService</w:t>
       </w:r>
+      <w:proofErr w:type="spellEnd"/>
     </w:p>
     <w:p>
       <w:pPr>
@@ -6105,6 +7817,7 @@
         </w:rPr>
         <w:t xml:space="preserve"> </w:t>
       </w:r>
+      <w:proofErr w:type="spellStart"/>
       <w:r>
         <w:rPr>
           <w:rFonts w:ascii="Consolas" w:hAnsi="Consolas" w:cs="Consolas"/>
@@ -6127,7 +7840,20 @@
           <w:szCs w:val="18"/>
           <w:lang w:eastAsia="en-US"/>
         </w:rPr>
-        <w:t>egisterUser(String username, String password, String role)</w:t>
+        <w:t>egisterUser</w:t>
+      </w:r>
+      <w:proofErr w:type="spellEnd"/>
+      <w:r>
+        <w:rPr>
+          <w:rFonts w:ascii="Consolas" w:hAnsi="Consolas" w:cs="Consolas"/>
+          <w:b/>
+          <w:bCs/>
+          <w:color w:val="000000"/>
+          <w:sz w:val="18"/>
+          <w:szCs w:val="18"/>
+          <w:lang w:eastAsia="en-US"/>
+        </w:rPr>
+        <w:t>(String username, String password, String role)</w:t>
       </w:r>
     </w:p>
     <w:p>
@@ -6189,6 +7915,7 @@
         </w:rPr>
         <w:t xml:space="preserve"> throw </w:t>
       </w:r>
+      <w:proofErr w:type="spellStart"/>
       <w:r>
         <w:rPr>
           <w:rFonts w:ascii="Consolas" w:hAnsi="Consolas" w:cs="Consolas"/>
@@ -6197,7 +7924,18 @@
           <w:szCs w:val="18"/>
           <w:lang w:eastAsia="en-US"/>
         </w:rPr>
-        <w:t xml:space="preserve">ArgumentException </w:t>
+        <w:t>ArgumentException</w:t>
+      </w:r>
+      <w:proofErr w:type="spellEnd"/>
+      <w:r>
+        <w:rPr>
+          <w:rFonts w:ascii="Consolas" w:hAnsi="Consolas" w:cs="Consolas"/>
+          <w:color w:val="77206D" w:themeColor="accent5" w:themeShade="BF"/>
+          <w:sz w:val="18"/>
+          <w:szCs w:val="18"/>
+          <w:lang w:eastAsia="en-US"/>
+        </w:rPr>
+        <w:t xml:space="preserve"> </w:t>
       </w:r>
       <w:r>
         <w:rPr>
@@ -6732,6 +8470,7 @@
         </w:rPr>
         <w:t xml:space="preserve"> bool </w:t>
       </w:r>
+      <w:proofErr w:type="spellStart"/>
       <w:r>
         <w:rPr>
           <w:rFonts w:ascii="Consolas" w:hAnsi="Consolas" w:cs="Consolas"/>
@@ -6754,7 +8493,20 @@
           <w:szCs w:val="18"/>
           <w:lang w:eastAsia="en-US"/>
         </w:rPr>
-        <w:t>oginUser(String username, String password)</w:t>
+        <w:t>oginUser</w:t>
+      </w:r>
+      <w:proofErr w:type="spellEnd"/>
+      <w:r>
+        <w:rPr>
+          <w:rFonts w:ascii="Consolas" w:hAnsi="Consolas" w:cs="Consolas"/>
+          <w:b/>
+          <w:bCs/>
+          <w:color w:val="000000"/>
+          <w:sz w:val="18"/>
+          <w:szCs w:val="18"/>
+          <w:lang w:eastAsia="en-US"/>
+        </w:rPr>
+        <w:t>(String username, String password)</w:t>
       </w:r>
     </w:p>
     <w:p>
@@ -6819,6 +8571,7 @@
         </w:rPr>
         <w:t xml:space="preserve"> throw </w:t>
       </w:r>
+      <w:proofErr w:type="spellStart"/>
       <w:r>
         <w:rPr>
           <w:rFonts w:ascii="Consolas" w:hAnsi="Consolas" w:cs="Consolas"/>
@@ -6827,7 +8580,18 @@
           <w:szCs w:val="18"/>
           <w:lang w:eastAsia="en-US"/>
         </w:rPr>
-        <w:t xml:space="preserve">ArgumentException </w:t>
+        <w:t>ArgumentException</w:t>
+      </w:r>
+      <w:proofErr w:type="spellEnd"/>
+      <w:r>
+        <w:rPr>
+          <w:rFonts w:ascii="Consolas" w:hAnsi="Consolas" w:cs="Consolas"/>
+          <w:color w:val="77206D" w:themeColor="accent5" w:themeShade="BF"/>
+          <w:sz w:val="18"/>
+          <w:szCs w:val="18"/>
+          <w:lang w:eastAsia="en-US"/>
+        </w:rPr>
+        <w:t xml:space="preserve"> </w:t>
       </w:r>
       <w:r>
         <w:rPr>
@@ -7247,6 +9011,7 @@
         </w:rPr>
         <w:t xml:space="preserve"> bool </w:t>
       </w:r>
+      <w:proofErr w:type="spellStart"/>
       <w:r>
         <w:rPr>
           <w:rFonts w:ascii="Consolas" w:hAnsi="Consolas" w:cs="Consolas"/>
@@ -7269,7 +9034,46 @@
           <w:szCs w:val="18"/>
           <w:lang w:eastAsia="en-US"/>
         </w:rPr>
-        <w:t>asAccess(String username, String requiredRole)</w:t>
+        <w:t>asAccess</w:t>
+      </w:r>
+      <w:proofErr w:type="spellEnd"/>
+      <w:r>
+        <w:rPr>
+          <w:rFonts w:ascii="Consolas" w:hAnsi="Consolas" w:cs="Consolas"/>
+          <w:b/>
+          <w:bCs/>
+          <w:color w:val="000000"/>
+          <w:sz w:val="18"/>
+          <w:szCs w:val="18"/>
+          <w:lang w:eastAsia="en-US"/>
+        </w:rPr>
+        <w:t xml:space="preserve">(String username, String </w:t>
+      </w:r>
+      <w:proofErr w:type="spellStart"/>
+      <w:r>
+        <w:rPr>
+          <w:rFonts w:ascii="Consolas" w:hAnsi="Consolas" w:cs="Consolas"/>
+          <w:b/>
+          <w:bCs/>
+          <w:color w:val="000000"/>
+          <w:sz w:val="18"/>
+          <w:szCs w:val="18"/>
+          <w:lang w:eastAsia="en-US"/>
+        </w:rPr>
+        <w:t>requiredRole</w:t>
+      </w:r>
+      <w:proofErr w:type="spellEnd"/>
+      <w:r>
+        <w:rPr>
+          <w:rFonts w:ascii="Consolas" w:hAnsi="Consolas" w:cs="Consolas"/>
+          <w:b/>
+          <w:bCs/>
+          <w:color w:val="000000"/>
+          <w:sz w:val="18"/>
+          <w:szCs w:val="18"/>
+          <w:lang w:eastAsia="en-US"/>
+        </w:rPr>
+        <w:t>)</w:t>
       </w:r>
     </w:p>
     <w:p>
@@ -7331,6 +9135,7 @@
         </w:rPr>
         <w:t xml:space="preserve">// throw </w:t>
       </w:r>
+      <w:proofErr w:type="spellStart"/>
       <w:r>
         <w:rPr>
           <w:rFonts w:ascii="Consolas" w:hAnsi="Consolas" w:cs="Consolas"/>
@@ -7339,7 +9144,18 @@
           <w:szCs w:val="18"/>
           <w:lang w:eastAsia="en-US"/>
         </w:rPr>
-        <w:t xml:space="preserve">ArgumentException </w:t>
+        <w:t>ArgumentException</w:t>
+      </w:r>
+      <w:proofErr w:type="spellEnd"/>
+      <w:r>
+        <w:rPr>
+          <w:rFonts w:ascii="Consolas" w:hAnsi="Consolas" w:cs="Consolas"/>
+          <w:color w:val="77206D" w:themeColor="accent5" w:themeShade="BF"/>
+          <w:sz w:val="18"/>
+          <w:szCs w:val="18"/>
+          <w:lang w:eastAsia="en-US"/>
+        </w:rPr>
+        <w:t xml:space="preserve"> </w:t>
       </w:r>
       <w:r>
         <w:rPr>
@@ -7377,16 +9193,10 @@
           <w:szCs w:val="18"/>
           <w:lang w:eastAsia="en-US"/>
         </w:rPr>
-        <w:t xml:space="preserve"> // return true if the user’s role matches the requiredRole</w:t>
-      </w:r>
-    </w:p>
-    <w:p>
-      <w:pPr>
-        <w:suppressAutoHyphens w:val="0"/>
-        <w:autoSpaceDE w:val="0"/>
-        <w:autoSpaceDN w:val="0"/>
-        <w:adjustRightInd w:val="0"/>
-        <w:ind w:firstLine="720"/>
+        <w:t xml:space="preserve"> // return true if the user’s role matches the </w:t>
+      </w:r>
+      <w:proofErr w:type="spellStart"/>
+      <w:r>
         <w:rPr>
           <w:rFonts w:ascii="Consolas" w:hAnsi="Consolas" w:cs="Consolas"/>
           <w:color w:val="3A7C22" w:themeColor="accent6" w:themeShade="BF"/>
@@ -7394,45 +9204,54 @@
           <w:szCs w:val="18"/>
           <w:lang w:eastAsia="en-US"/>
         </w:rPr>
-      </w:pPr>
-      <w:r>
-        <w:rPr>
-          <w:rFonts w:ascii="Consolas" w:hAnsi="Consolas" w:cs="Consolas"/>
-          <w:b/>
-          <w:bCs/>
+        <w:t>requiredRole</w:t>
+      </w:r>
+      <w:proofErr w:type="spellEnd"/>
+    </w:p>
+    <w:p>
+      <w:pPr>
+        <w:suppressAutoHyphens w:val="0"/>
+        <w:autoSpaceDE w:val="0"/>
+        <w:autoSpaceDN w:val="0"/>
+        <w:adjustRightInd w:val="0"/>
+        <w:ind w:firstLine="720"/>
+        <w:rPr>
+          <w:rFonts w:ascii="Consolas" w:hAnsi="Consolas" w:cs="Consolas"/>
           <w:color w:val="3A7C22" w:themeColor="accent6" w:themeShade="BF"/>
           <w:sz w:val="18"/>
           <w:szCs w:val="18"/>
           <w:lang w:eastAsia="en-US"/>
         </w:rPr>
-        <w:t xml:space="preserve"> // </w:t>
-      </w:r>
-      <w:r>
-        <w:rPr>
-          <w:rFonts w:ascii="Consolas" w:hAnsi="Consolas" w:cs="Consolas"/>
+      </w:pPr>
+      <w:r>
+        <w:rPr>
+          <w:rFonts w:ascii="Consolas" w:hAnsi="Consolas" w:cs="Consolas"/>
+          <w:b/>
+          <w:bCs/>
           <w:color w:val="3A7C22" w:themeColor="accent6" w:themeShade="BF"/>
           <w:sz w:val="18"/>
           <w:szCs w:val="18"/>
           <w:lang w:eastAsia="en-US"/>
         </w:rPr>
-        <w:t>else return false</w:t>
-      </w:r>
-    </w:p>
-    <w:p>
-      <w:pPr>
-        <w:suppressAutoHyphens w:val="0"/>
-        <w:autoSpaceDE w:val="0"/>
-        <w:autoSpaceDN w:val="0"/>
-        <w:adjustRightInd w:val="0"/>
-        <w:rPr>
-          <w:rFonts w:ascii="Consolas" w:hAnsi="Consolas" w:cs="Consolas"/>
-          <w:color w:val="000000"/>
+        <w:t xml:space="preserve"> // </w:t>
+      </w:r>
+      <w:r>
+        <w:rPr>
+          <w:rFonts w:ascii="Consolas" w:hAnsi="Consolas" w:cs="Consolas"/>
+          <w:color w:val="3A7C22" w:themeColor="accent6" w:themeShade="BF"/>
           <w:sz w:val="18"/>
           <w:szCs w:val="18"/>
           <w:lang w:eastAsia="en-US"/>
         </w:rPr>
-      </w:pPr>
-      <w:r>
+        <w:t>else return false</w:t>
+      </w:r>
+    </w:p>
+    <w:p>
+      <w:pPr>
+        <w:suppressAutoHyphens w:val="0"/>
+        <w:autoSpaceDE w:val="0"/>
+        <w:autoSpaceDN w:val="0"/>
+        <w:adjustRightInd w:val="0"/>
         <w:rPr>
           <w:rFonts w:ascii="Consolas" w:hAnsi="Consolas" w:cs="Consolas"/>
           <w:color w:val="000000"/>
@@ -7440,15 +9259,8 @@
           <w:szCs w:val="18"/>
           <w:lang w:eastAsia="en-US"/>
         </w:rPr>
-        <w:t xml:space="preserve">    }</w:t>
-      </w:r>
-    </w:p>
-    <w:p>
-      <w:pPr>
-        <w:suppressAutoHyphens w:val="0"/>
-        <w:autoSpaceDE w:val="0"/>
-        <w:autoSpaceDN w:val="0"/>
-        <w:adjustRightInd w:val="0"/>
+      </w:pPr>
+      <w:r>
         <w:rPr>
           <w:rFonts w:ascii="Consolas" w:hAnsi="Consolas" w:cs="Consolas"/>
           <w:color w:val="000000"/>
@@ -7456,8 +9268,15 @@
           <w:szCs w:val="18"/>
           <w:lang w:eastAsia="en-US"/>
         </w:rPr>
-      </w:pPr>
-      <w:r>
+        <w:t xml:space="preserve">    }</w:t>
+      </w:r>
+    </w:p>
+    <w:p>
+      <w:pPr>
+        <w:suppressAutoHyphens w:val="0"/>
+        <w:autoSpaceDE w:val="0"/>
+        <w:autoSpaceDN w:val="0"/>
+        <w:adjustRightInd w:val="0"/>
         <w:rPr>
           <w:rFonts w:ascii="Consolas" w:hAnsi="Consolas" w:cs="Consolas"/>
           <w:color w:val="000000"/>
@@ -7465,15 +9284,8 @@
           <w:szCs w:val="18"/>
           <w:lang w:eastAsia="en-US"/>
         </w:rPr>
-        <w:t>}</w:t>
-      </w:r>
-    </w:p>
-    <w:p>
-      <w:pPr>
-        <w:suppressAutoHyphens w:val="0"/>
-        <w:autoSpaceDE w:val="0"/>
-        <w:autoSpaceDN w:val="0"/>
-        <w:adjustRightInd w:val="0"/>
+      </w:pPr>
+      <w:r>
         <w:rPr>
           <w:rFonts w:ascii="Consolas" w:hAnsi="Consolas" w:cs="Consolas"/>
           <w:color w:val="000000"/>
@@ -7481,6 +9293,22 @@
           <w:szCs w:val="18"/>
           <w:lang w:eastAsia="en-US"/>
         </w:rPr>
+        <w:t>}</w:t>
+      </w:r>
+    </w:p>
+    <w:p>
+      <w:pPr>
+        <w:suppressAutoHyphens w:val="0"/>
+        <w:autoSpaceDE w:val="0"/>
+        <w:autoSpaceDN w:val="0"/>
+        <w:adjustRightInd w:val="0"/>
+        <w:rPr>
+          <w:rFonts w:ascii="Consolas" w:hAnsi="Consolas" w:cs="Consolas"/>
+          <w:color w:val="000000"/>
+          <w:sz w:val="18"/>
+          <w:szCs w:val="18"/>
+          <w:lang w:eastAsia="en-US"/>
+        </w:rPr>
       </w:pPr>
     </w:p>
     <w:p>
@@ -7853,6 +9681,7 @@
         </w:rPr>
         <w:t xml:space="preserve">        </w:t>
       </w:r>
+      <w:proofErr w:type="spellStart"/>
       <w:r>
         <w:rPr>
           <w:rFonts w:ascii="Consolas" w:hAnsi="Consolas" w:cs="Consolas"/>
@@ -7871,7 +9700,18 @@
           <w:szCs w:val="19"/>
           <w:lang w:eastAsia="en-US"/>
         </w:rPr>
-        <w:t>.username = username;</w:t>
+        <w:t>.username</w:t>
+      </w:r>
+      <w:proofErr w:type="spellEnd"/>
+      <w:r>
+        <w:rPr>
+          <w:rFonts w:ascii="Consolas" w:hAnsi="Consolas" w:cs="Consolas"/>
+          <w:color w:val="000000"/>
+          <w:sz w:val="19"/>
+          <w:szCs w:val="19"/>
+          <w:lang w:eastAsia="en-US"/>
+        </w:rPr>
+        <w:t xml:space="preserve"> = username;</w:t>
       </w:r>
     </w:p>
     <w:p>
@@ -7900,6 +9740,7 @@
         </w:rPr>
         <w:t xml:space="preserve">        </w:t>
       </w:r>
+      <w:proofErr w:type="spellStart"/>
       <w:r>
         <w:rPr>
           <w:rFonts w:ascii="Consolas" w:hAnsi="Consolas" w:cs="Consolas"/>
@@ -7918,7 +9759,18 @@
           <w:szCs w:val="19"/>
           <w:lang w:eastAsia="en-US"/>
         </w:rPr>
-        <w:t>.password = password;</w:t>
+        <w:t>.password</w:t>
+      </w:r>
+      <w:proofErr w:type="spellEnd"/>
+      <w:r>
+        <w:rPr>
+          <w:rFonts w:ascii="Consolas" w:hAnsi="Consolas" w:cs="Consolas"/>
+          <w:color w:val="000000"/>
+          <w:sz w:val="19"/>
+          <w:szCs w:val="19"/>
+          <w:lang w:eastAsia="en-US"/>
+        </w:rPr>
+        <w:t xml:space="preserve"> = password;</w:t>
       </w:r>
     </w:p>
     <w:p>
@@ -7947,6 +9799,7 @@
         </w:rPr>
         <w:t xml:space="preserve">        </w:t>
       </w:r>
+      <w:proofErr w:type="spellStart"/>
       <w:r>
         <w:rPr>
           <w:rFonts w:ascii="Consolas" w:hAnsi="Consolas" w:cs="Consolas"/>
@@ -7965,7 +9818,18 @@
           <w:szCs w:val="19"/>
           <w:lang w:eastAsia="en-US"/>
         </w:rPr>
-        <w:t>.role = role;</w:t>
+        <w:t>.role</w:t>
+      </w:r>
+      <w:proofErr w:type="spellEnd"/>
+      <w:r>
+        <w:rPr>
+          <w:rFonts w:ascii="Consolas" w:hAnsi="Consolas" w:cs="Consolas"/>
+          <w:color w:val="000000"/>
+          <w:sz w:val="19"/>
+          <w:szCs w:val="19"/>
+          <w:lang w:eastAsia="en-US"/>
+        </w:rPr>
+        <w:t xml:space="preserve"> = role;</w:t>
       </w:r>
     </w:p>
     <w:p>
@@ -8064,7 +9928,33 @@
           <w:szCs w:val="19"/>
           <w:lang w:eastAsia="en-US"/>
         </w:rPr>
-        <w:t xml:space="preserve"> String getUsername()  {</w:t>
+        <w:t xml:space="preserve"> String </w:t>
+      </w:r>
+      <w:proofErr w:type="spellStart"/>
+      <w:r>
+        <w:rPr>
+          <w:rFonts w:ascii="Consolas" w:hAnsi="Consolas" w:cs="Consolas"/>
+          <w:b/>
+          <w:bCs/>
+          <w:color w:val="000000"/>
+          <w:sz w:val="19"/>
+          <w:szCs w:val="19"/>
+          <w:lang w:eastAsia="en-US"/>
+        </w:rPr>
+        <w:t>getUsername</w:t>
+      </w:r>
+      <w:proofErr w:type="spellEnd"/>
+      <w:r>
+        <w:rPr>
+          <w:rFonts w:ascii="Consolas" w:hAnsi="Consolas" w:cs="Consolas"/>
+          <w:b/>
+          <w:bCs/>
+          <w:color w:val="000000"/>
+          <w:sz w:val="19"/>
+          <w:szCs w:val="19"/>
+          <w:lang w:eastAsia="en-US"/>
+        </w:rPr>
+        <w:t>()  {</w:t>
       </w:r>
     </w:p>
     <w:p>
@@ -8210,7 +10100,33 @@
           <w:szCs w:val="19"/>
           <w:lang w:eastAsia="en-US"/>
         </w:rPr>
-        <w:t xml:space="preserve"> String getPassword() {</w:t>
+        <w:t xml:space="preserve"> String </w:t>
+      </w:r>
+      <w:proofErr w:type="spellStart"/>
+      <w:r>
+        <w:rPr>
+          <w:rFonts w:ascii="Consolas" w:hAnsi="Consolas" w:cs="Consolas"/>
+          <w:b/>
+          <w:bCs/>
+          <w:color w:val="000000"/>
+          <w:sz w:val="19"/>
+          <w:szCs w:val="19"/>
+          <w:lang w:eastAsia="en-US"/>
+        </w:rPr>
+        <w:t>getPassword</w:t>
+      </w:r>
+      <w:proofErr w:type="spellEnd"/>
+      <w:r>
+        <w:rPr>
+          <w:rFonts w:ascii="Consolas" w:hAnsi="Consolas" w:cs="Consolas"/>
+          <w:b/>
+          <w:bCs/>
+          <w:color w:val="000000"/>
+          <w:sz w:val="19"/>
+          <w:szCs w:val="19"/>
+          <w:lang w:eastAsia="en-US"/>
+        </w:rPr>
+        <w:t>() {</w:t>
       </w:r>
     </w:p>
     <w:p>
@@ -8356,7 +10272,33 @@
           <w:szCs w:val="19"/>
           <w:lang w:eastAsia="en-US"/>
         </w:rPr>
-        <w:t xml:space="preserve"> String getRole()  {</w:t>
+        <w:t xml:space="preserve"> String </w:t>
+      </w:r>
+      <w:proofErr w:type="spellStart"/>
+      <w:r>
+        <w:rPr>
+          <w:rFonts w:ascii="Consolas" w:hAnsi="Consolas" w:cs="Consolas"/>
+          <w:b/>
+          <w:bCs/>
+          <w:color w:val="000000"/>
+          <w:sz w:val="19"/>
+          <w:szCs w:val="19"/>
+          <w:lang w:eastAsia="en-US"/>
+        </w:rPr>
+        <w:t>getRole</w:t>
+      </w:r>
+      <w:proofErr w:type="spellEnd"/>
+      <w:r>
+        <w:rPr>
+          <w:rFonts w:ascii="Consolas" w:hAnsi="Consolas" w:cs="Consolas"/>
+          <w:b/>
+          <w:bCs/>
+          <w:color w:val="000000"/>
+          <w:sz w:val="19"/>
+          <w:szCs w:val="19"/>
+          <w:lang w:eastAsia="en-US"/>
+        </w:rPr>
+        <w:t>()  {</w:t>
       </w:r>
     </w:p>
     <w:p>

</xml_diff>